<commit_message>
Prove Proposition 1 for negative-binomial baseline; add Stackelberg attacker-platform game
Co-Authored-By: Claude Sonnet 5.5 <noreply@anthropic.com>
Claude-Session: https://claude.ai/code/session_01GxnhmxUGY8a7A6BSHAY7ah
</commit_message>
<xml_diff>
--- a/LLM_Jailbreak_Screening_ISR_revised.docx
+++ b/LLM_Jailbreak_Screening_ISR_revised.docx
@@ -44,7 +44,7 @@
           <w:b w:val="0"/>
           <w:i w:val="0"/>
         </w:rPr>
-        <w:t>Large language model (LLM) platforms defend against jailbreak and prompt-injection attacks with neural guardrail models (e.g., Llama Guard). Running a guardrail on every prompt consumes scarce GPU capacity and adds latency to every legitimate transaction, yet removing it exposes the platform to breach liability. Automated jailbreak campaigns make the problem sharper: they are bursts of high-volume adversarial traffic that appear as a sudden change in the arrival process of policy-violating prompts. We propose a two-tier architecture in which an inexpensive lexical counter (Tier 1) monitors the arrival process of flagged prompts and activates the semantic guardrail (Tier 2) only when the count is statistically inconsistent with a calibrated benign baseline. The baseline is modeled as a doubly stochastic (Cox) Poisson process with a diurnal intensity, which gives a time-varying negative-binomial control limit. We (i) derive the cost-minimizing activation threshold and show it is characterized by a likelihood-ratio condition, (ii) bound the throughput an adaptive attacker can sustain without being detected, and (iii) evaluate the design in a simulation of seven-day traces with 300 replications against always-on, fixed-threshold, CUSUM, and random-sampling benchmarks. For high-intensity campaigns (8 prompts/min against a baseline of 0.5/min) the design screens 98% of malicious prompts while using about 5% of the always-on guardrail capacity; a CUSUM statistic dominates the Shewhart-type rule for moderate campaigns. The design is, however, fragile against campaigns that evade Tier 1 lexically, and we quantify this limitation. The results yield design rules for cost-effective governance of generative-AI platforms.</w:t>
+        <w:t>Large language model (LLM) platforms defend against jailbreak and prompt-injection attacks with neural guardrail models (e.g., Llama Guard). Running a guardrail on every prompt consumes scarce GPU capacity and adds latency to every legitimate transaction, yet removing it exposes the platform to breach liability. Automated jailbreak campaigns make the problem sharper: they are bursts of high-volume adversarial traffic that appear as a sudden change in the arrival process of policy-violating prompts. We propose a two-tier architecture in which an inexpensive lexical counter (Tier 1) monitors the arrival process of flagged prompts and activates the semantic guardrail (Tier 2) only when the count is statistically inconsistent with a calibrated benign baseline. The baseline is modeled as a doubly stochastic (Cox) Poisson process with a diurnal intensity, which gives a time-varying negative-binomial control limit. We (i) derive the cost-minimizing activation threshold and show it is characterized by a likelihood-ratio condition, (ii) bound the throughput an adaptive attacker can sustain without being detected and solve a Stackelberg game in which the attacker best-responds to the threshold, and (iii) evaluate the design in a simulation of seven-day traces with 300 replications against always-on, fixed-threshold, CUSUM, and random-sampling benchmarks. For high-intensity campaigns (8 prompts/min against a baseline of 0.5/min) the design screens 98% of malicious prompts while using about 5% of the always-on guardrail capacity; a CUSUM statistic dominates the Shewhart-type rule for moderate campaigns. The design is, however, fragile against campaigns that evade Tier 1 lexically, and a threshold designed against a fixed attack understates the cost under a best-responding attacker by a factor of four to six; the Stackelberg threshold reduces that cost by 18–44%. The results yield design rules for cost-effective governance of generative-AI platforms.</w:t>
       </w:r>
     </w:p>
     <w:p>
@@ -98,7 +98,7 @@
           <w:b w:val="0"/>
           <w:i w:val="0"/>
         </w:rPr>
-        <w:t>Our premise is that automated campaigns are, from the platform's viewpoint, a change in the arrival process of flagged prompts, and that such changes can be detected cheaply with statistical process control (SPC) before any expensive semantic inference is invoked. We pose the following questions. (RQ1) How should a platform set the activation threshold of an expensive guardrail when benign traffic is non-stationary and costs of false alarms and misses are asymmetric? (RQ2) How much attack throughput can an adaptive adversary push through undetected, and how does lexical evasion change this? (RQ3) How much guardrail capacity can such a design save relative to always-on screening and to alternative detection rules, and at what loss of coverage?</w:t>
+        <w:t>Our premise is that automated campaigns are, from the platform's viewpoint, a change in the arrival process of flagged prompts, and that such changes can be detected cheaply with statistical process control (SPC) before any expensive semantic inference is invoked. We pose the following questions. (RQ1) How should a platform set the activation threshold of an expensive guardrail when benign traffic is non-stationary and costs of false alarms and misses are asymmetric? (RQ2) How much attack throughput can an adaptive adversary push through undetected, how should the platform set its threshold when the attacker best-responds, and how does lexical evasion change this? (RQ3) How much guardrail capacity can such a design save relative to always-on screening and to alternative detection rules, and at what loss of coverage?</w:t>
       </w:r>
     </w:p>
     <w:p>
@@ -110,7 +110,7 @@
           <w:b w:val="0"/>
           <w:i w:val="0"/>
         </w:rPr>
-        <w:t>Following the design-science tradition in information systems (Hevner et al. 2004), the artifact is a screening architecture together with a threshold-design method; we evaluate it analytically and by simulation against explicit benchmarks. Our contributions are: (1) a formulation of guardrail activation as a sequential detection problem with a Cox-process baseline, which corrects the common simplification of treating benign noise as an additive random term of a Poisson intensity; (2) a closed-form likelihood-ratio characterization of the cost-minimizing threshold (Proposition 1); (3) a bound on undetected attack throughput (Proposition 2) and an evaluation of lexical evasion; and (4) a transparent simulation study that reports false alarms, coverage, delay, and capacity use against four benchmarks, including cases in which the proposed rule performs poorly.</w:t>
+        <w:t>Following the design-science tradition in information systems (Hevner et al. 2004), the artifact is a screening architecture together with a threshold-design method; we evaluate it analytically and by simulation against explicit benchmarks. Our contributions are: (1) a formulation of guardrail activation as a sequential detection problem with a Cox-process baseline, which corrects the common simplification of treating benign noise as an additive random term of a Poisson intensity; (2) a closed-form likelihood-ratio characterization of the cost-minimizing threshold (Proposition 1); (3) a bound on undetected attack throughput (Proposition 2), a Stackelberg formulation in which the attacker best-responds to the threshold (Proposition 3), and an evaluation of lexical evasion; and (4) a transparent simulation study that reports false alarms, coverage, delay, and capacity use against four benchmarks, including cases in which the proposed rule performs poorly.</w:t>
       </w:r>
     </w:p>
     <w:p>
@@ -319,7 +319,7 @@
         <w:t xml:space="preserve">Proposition 1 (cost-minimizing threshold). </w:t>
       </w:r>
       <w:r>
-        <w:t>Let f₀ and f₁ be the probability mass functions of x under no attack and under attack, with f₁/f₀ strictly increasing (this holds when benign counts are Poisson with mean μ₀ and an attack adds an independent Poisson(b) count: f₁(k)/f₀(k) = ((μ₀+b)/μ₀)^k e^{−b}). Then J is quasi-convex in K and the optimal cutoff is K* = min{ K ≥ −1 : f₁(K+1)/f₀(K+1) ≥ π₀C / (π₁ρM) }, where K* = −1 means always-on screening. K* is non-decreasing in C/(ρM).</w:t>
+        <w:t>Let f₀ be the probability mass function of the benign count on {0,1,2,…}, and suppose f₀ is log-concave, i.e., f₀(i)/f₀(i−1) is non-increasing in i. This holds for the Poisson distribution and for the negative binomial with shape κ ≥ 1. Let the attack add an independent non-negative integer count with mass function g (for example Poisson(b)), so that f₁ = f₀ * g. Then the likelihood ratio L(k) = f₁(k)/f₀(k) is non-decreasing, J is quasi-convex in K, and an optimal cutoff is K* = min{ K ≥ −1 : L(K+1) ≥ π₀C / (π₁ρM) }, where K* = −1 means always-on screening. K* is non-decreasing in C/(ρM). With a Poisson baseline and Poisson(b) attack increment, L(k) = ((μ₀+b)/μ₀)^k e^{−b}.</w:t>
       </w:r>
     </w:p>
     <w:p>
@@ -331,7 +331,7 @@
           <w:b w:val="0"/>
           <w:i w:val="0"/>
         </w:rPr>
-        <w:t>The proof is in Appendix A. The proposition has two practical implications. First, "always screen" is the optimal policy when the breach cost per attack window is large relative to the screening cost per window (K* = −1). Tier-1 gating is valuable only when screening is expensive enough, through GPU contention or user-visible latency, relative to the loss it prevents. Second, the SPC rule (2) with a fixed α is the special case in which the false-alarm constraint is exogenous; Proposition 1 shows what α implicitly assumes about cost ratios. Table 1 gives optimal cutoffs for μ₀ = 0.5; the cutoff rises with the visible attack rate b because stronger attacks stay detectable at a higher cutoff.</w:t>
+        <w:t>The proof is in Appendix A. The proposition has two practical implications. First, "always screen" is the optimal policy when the breach cost per attack window is large relative to the screening cost per window (K* = −1). Tier-1 gating is valuable only when screening is expensive enough, through GPU contention or user-visible latency, relative to the loss it prevents. Second, the SPC rule (2) with a fixed α is the special case in which the false-alarm constraint is exogenous; Proposition 1 shows what α implicitly assumes about cost ratios. The proposition covers the negative-binomial baseline of model (1), applied window by window with the mean μ_t, so the economically optimal limit is also time-varying. Table 1 gives optimal cutoffs for the Poisson case with μ₀ = 0.5; the cutoff rises with the visible attack rate b because stronger attacks stay detectable at a higher cutoff.</w:t>
       </w:r>
     </w:p>
     <w:p>
@@ -1512,6 +1512,1182 @@
           <w:i w:val="0"/>
         </w:rPr>
         <w:t>The Shewhart rule uses one window at a time and is insensitive to small persistent shifts. A one-sided CUSUM on standardized counts, S_t = max(0, S_{t−1} + (x_t − μ_t)/σ_t − k), triggers when S_t exceeds h, where σ_t² = μ_t + μ_t²/κ. It uses the same calibrated baseline, so the NHPP/Cox calibration is the core of the design and the monitoring statistic is interchangeable. We evaluate both.</w:t>
+      </w:r>
+    </w:p>
+    <w:p>
+      <w:pPr>
+        <w:pStyle w:val="Heading2"/>
+      </w:pPr>
+      <w:r>
+        <w:t>3.7 Strategic attacker: a Stackelberg formulation</w:t>
+      </w:r>
+    </w:p>
+    <w:p>
+      <w:pPr>
+        <w:jc w:val="both"/>
+      </w:pPr>
+      <w:r>
+        <w:rPr>
+          <w:b w:val="0"/>
+          <w:i w:val="0"/>
+        </w:rPr>
+        <w:t>Propositions 1 and 2 treat the attack as exogenous. We now let the attacker respond to the platform's threshold. The platform (leader) commits to a cutoff K; the attacker (follower) observes it, or learns it by probing, and chooses a campaign intensity a ∈ (0, ā] prompts per window, where ā is the maximum rate the platform's infrastructure admits (the effect of rate limiting). A campaign lasts n windows. With visible rate b = a(1−e), the per-window trigger probability is p = p(K, b) = P(Poisson(μ₀+b) &gt; K). Once a trigger occurs, Tier 2 and throttling take effect from the next window and end the campaign. The attacker delivers a prompts in every window up to and including the triggering window, so the expected number of unscreened malicious prompts is</w:t>
+      </w:r>
+    </w:p>
+    <w:p>
+      <w:pPr>
+        <w:jc w:val="center"/>
+      </w:pPr>
+      <w:r>
+        <w:rPr>
+          <w:i/>
+        </w:rPr>
+        <w:t>U(K,a) = a Σ_{t=0}^{n−1} (1−p)^t = a [1 − (1−p)ⁿ] / p</w:t>
+      </w:r>
+      <w:r>
+        <w:t xml:space="preserve">        (4)</w:t>
+      </w:r>
+    </w:p>
+    <w:p>
+      <w:pPr>
+        <w:jc w:val="both"/>
+      </w:pPr>
+      <w:r>
+        <w:rPr>
+          <w:b w:val="0"/>
+          <w:i w:val="0"/>
+        </w:rPr>
+        <w:t>We assume the attacker values each delivered prompt above its cost and therefore maximizes U; this is the case in which the attacker's payoff is proportional to delivered volume. The platform bears false-trigger cost c_f per false activation (c_f = C·H, the cost of H windows of Tier 2) over the W windows of the planning day, and a damage d per unscreened prompt (d = ρM per prompt in the notation above), so its daily cost is</w:t>
+      </w:r>
+    </w:p>
+    <w:p>
+      <w:pPr>
+        <w:jc w:val="center"/>
+      </w:pPr>
+      <w:r>
+        <w:rPr>
+          <w:i/>
+        </w:rPr>
+        <w:t>Γ(K) = W · P₀(x&gt;K) · c_f + d · V(K),   V(K) = max_{0&lt;a≤ā} U(K,a)</w:t>
+      </w:r>
+      <w:r>
+        <w:t xml:space="preserve">        (5)</w:t>
+      </w:r>
+    </w:p>
+    <w:p>
+      <w:r>
+        <w:rPr>
+          <w:b/>
+        </w:rPr>
+        <w:t xml:space="preserve">Proposition 3 (attacker best response and leader's problem). </w:t>
+      </w:r>
+      <w:r>
+        <w:t>(i) U(K,·) is continuous on (0,ā] with U(K,a) → 0 as a → 0, so a best response a*(K) exists. (ii) For every a, U(K,a) is non-decreasing in K; hence V(K) is non-decreasing in K, while the false-trigger term of Γ is strictly decreasing in K, so Γ is a sum of a decreasing and a non-decreasing function and its minimizer K^S is determined by their trade-off. (iii) For every K, V(K) ≥ ā: because a trigger takes effect only from the next window, a burst at the maximum admitted rate delivers at least ā prompts before any activation. (iv) U(K,a) ≤ min{ n·a, a/p(K,b) }.</w:t>
+      </w:r>
+    </w:p>
+    <w:p>
+      <w:pPr>
+        <w:jc w:val="both"/>
+      </w:pPr>
+      <w:r>
+        <w:rPr>
+          <w:b w:val="0"/>
+          <w:i w:val="0"/>
+        </w:rPr>
+        <w:t>Parts (iii)–(iv) deserve emphasis. Window-based gating has a first-window leak equal to whatever the platform admits in one window, so the maximum admitted rate ā (rate limiting) is a design variable on par with the threshold. For sensitive cutoffs (K ≤ 3 at μ₀ = 0.5), the attacker's best response is the burst a* = ā, which delivers ā prompts; for higher cutoffs (K ≥ 4) the best response is an interior, low-rate "stealth" intensity a* ∈ [0.95, 3.4] that stays just under the control limit and delivers considerably more than the burst. Table 5 reports the best responses for μ₀ = 0.5, n = 60, and ā = 20, and the closed form (4) matched a Monte Carlo estimate (K = 4, a = 1: 36.4 versus 36.3; K = 3, a = 2: 8.25 versus 8.30).</w:t>
+      </w:r>
+    </w:p>
+    <w:p>
+      <w:r>
+        <w:rPr>
+          <w:b/>
+          <w:i w:val="0"/>
+          <w:sz w:val="20"/>
+        </w:rPr>
+        <w:t>Table 5. Attacker best response to the platform cutoff (μ₀ = 0.5, n = 60 windows, ā = 20, e = 0).</w:t>
+      </w:r>
+    </w:p>
+    <w:tbl>
+      <w:tblPr>
+        <w:tblStyle w:val="TableGrid"/>
+        <w:tblW w:type="auto" w:w="0"/>
+        <w:tblLook w:firstColumn="1" w:firstRow="1" w:lastColumn="0" w:lastRow="0" w:noHBand="0" w:noVBand="1" w:val="04A0"/>
+      </w:tblPr>
+      <w:tblGrid>
+        <w:gridCol w:w="2351"/>
+        <w:gridCol w:w="2351"/>
+        <w:gridCol w:w="2351"/>
+        <w:gridCol w:w="2351"/>
+      </w:tblGrid>
+      <w:tr>
+        <w:tc>
+          <w:tcPr>
+            <w:tcW w:type="dxa" w:w="2351"/>
+          </w:tcPr>
+          <w:p>
+            <w:pPr>
+              <w:spacing w:after="0"/>
+            </w:pPr>
+            <w:r/>
+            <w:r>
+              <w:rPr>
+                <w:b/>
+                <w:sz w:val="18"/>
+              </w:rPr>
+              <w:t>Cutoff K</w:t>
+            </w:r>
+          </w:p>
+        </w:tc>
+        <w:tc>
+          <w:tcPr>
+            <w:tcW w:type="dxa" w:w="2351"/>
+          </w:tcPr>
+          <w:p>
+            <w:pPr>
+              <w:spacing w:after="0"/>
+            </w:pPr>
+            <w:r/>
+            <w:r>
+              <w:rPr>
+                <w:b/>
+                <w:sz w:val="18"/>
+              </w:rPr>
+              <w:t>Attacker best response a*</w:t>
+            </w:r>
+          </w:p>
+        </w:tc>
+        <w:tc>
+          <w:tcPr>
+            <w:tcW w:type="dxa" w:w="2351"/>
+          </w:tcPr>
+          <w:p>
+            <w:pPr>
+              <w:spacing w:after="0"/>
+            </w:pPr>
+            <w:r/>
+            <w:r>
+              <w:rPr>
+                <w:b/>
+                <w:sz w:val="18"/>
+              </w:rPr>
+              <w:t>Unscreened prompts V(K)</w:t>
+            </w:r>
+          </w:p>
+        </w:tc>
+        <w:tc>
+          <w:tcPr>
+            <w:tcW w:type="dxa" w:w="2351"/>
+          </w:tcPr>
+          <w:p>
+            <w:pPr>
+              <w:spacing w:after="0"/>
+            </w:pPr>
+            <w:r/>
+            <w:r>
+              <w:rPr>
+                <w:b/>
+                <w:sz w:val="18"/>
+              </w:rPr>
+              <w:t>Delivered if a = 8</w:t>
+            </w:r>
+          </w:p>
+        </w:tc>
+      </w:tr>
+      <w:tr>
+        <w:tc>
+          <w:tcPr>
+            <w:tcW w:type="dxa" w:w="2351"/>
+          </w:tcPr>
+          <w:p>
+            <w:pPr>
+              <w:spacing w:after="0"/>
+            </w:pPr>
+            <w:r/>
+            <w:r>
+              <w:rPr>
+                <w:b w:val="0"/>
+                <w:sz w:val="18"/>
+              </w:rPr>
+              <w:t>3</w:t>
+            </w:r>
+          </w:p>
+        </w:tc>
+        <w:tc>
+          <w:tcPr>
+            <w:tcW w:type="dxa" w:w="2351"/>
+          </w:tcPr>
+          <w:p>
+            <w:pPr>
+              <w:spacing w:after="0"/>
+            </w:pPr>
+            <w:r/>
+            <w:r>
+              <w:rPr>
+                <w:b w:val="0"/>
+                <w:sz w:val="18"/>
+              </w:rPr>
+              <w:t>20 (burst)</w:t>
+            </w:r>
+          </w:p>
+        </w:tc>
+        <w:tc>
+          <w:tcPr>
+            <w:tcW w:type="dxa" w:w="2351"/>
+          </w:tcPr>
+          <w:p>
+            <w:pPr>
+              <w:spacing w:after="0"/>
+            </w:pPr>
+            <w:r/>
+            <w:r>
+              <w:rPr>
+                <w:b w:val="0"/>
+                <w:sz w:val="18"/>
+              </w:rPr>
+              <w:t>20.0</w:t>
+            </w:r>
+          </w:p>
+        </w:tc>
+        <w:tc>
+          <w:tcPr>
+            <w:tcW w:type="dxa" w:w="2351"/>
+          </w:tcPr>
+          <w:p>
+            <w:pPr>
+              <w:spacing w:after="0"/>
+            </w:pPr>
+            <w:r/>
+            <w:r>
+              <w:rPr>
+                <w:b w:val="0"/>
+                <w:sz w:val="18"/>
+              </w:rPr>
+              <w:t>8.2</w:t>
+            </w:r>
+          </w:p>
+        </w:tc>
+      </w:tr>
+      <w:tr>
+        <w:tc>
+          <w:tcPr>
+            <w:tcW w:type="dxa" w:w="2351"/>
+          </w:tcPr>
+          <w:p>
+            <w:pPr>
+              <w:spacing w:after="0"/>
+            </w:pPr>
+            <w:r/>
+            <w:r>
+              <w:rPr>
+                <w:b w:val="0"/>
+                <w:sz w:val="18"/>
+              </w:rPr>
+              <w:t>4</w:t>
+            </w:r>
+          </w:p>
+        </w:tc>
+        <w:tc>
+          <w:tcPr>
+            <w:tcW w:type="dxa" w:w="2351"/>
+          </w:tcPr>
+          <w:p>
+            <w:pPr>
+              <w:spacing w:after="0"/>
+            </w:pPr>
+            <w:r/>
+            <w:r>
+              <w:rPr>
+                <w:b w:val="0"/>
+                <w:sz w:val="18"/>
+              </w:rPr>
+              <w:t>0.95 (stealth)</w:t>
+            </w:r>
+          </w:p>
+        </w:tc>
+        <w:tc>
+          <w:tcPr>
+            <w:tcW w:type="dxa" w:w="2351"/>
+          </w:tcPr>
+          <w:p>
+            <w:pPr>
+              <w:spacing w:after="0"/>
+            </w:pPr>
+            <w:r/>
+            <w:r>
+              <w:rPr>
+                <w:b w:val="0"/>
+                <w:sz w:val="18"/>
+              </w:rPr>
+              <w:t>36.5</w:t>
+            </w:r>
+          </w:p>
+        </w:tc>
+        <w:tc>
+          <w:tcPr>
+            <w:tcW w:type="dxa" w:w="2351"/>
+          </w:tcPr>
+          <w:p>
+            <w:pPr>
+              <w:spacing w:after="0"/>
+            </w:pPr>
+            <w:r/>
+            <w:r>
+              <w:rPr>
+                <w:b w:val="0"/>
+                <w:sz w:val="18"/>
+              </w:rPr>
+              <w:t>8.6</w:t>
+            </w:r>
+          </w:p>
+        </w:tc>
+      </w:tr>
+      <w:tr>
+        <w:tc>
+          <w:tcPr>
+            <w:tcW w:type="dxa" w:w="2351"/>
+          </w:tcPr>
+          <w:p>
+            <w:pPr>
+              <w:spacing w:after="0"/>
+            </w:pPr>
+            <w:r/>
+            <w:r>
+              <w:rPr>
+                <w:b w:val="0"/>
+                <w:sz w:val="18"/>
+              </w:rPr>
+              <w:t>5</w:t>
+            </w:r>
+          </w:p>
+        </w:tc>
+        <w:tc>
+          <w:tcPr>
+            <w:tcW w:type="dxa" w:w="2351"/>
+          </w:tcPr>
+          <w:p>
+            <w:pPr>
+              <w:spacing w:after="0"/>
+            </w:pPr>
+            <w:r/>
+            <w:r>
+              <w:rPr>
+                <w:b w:val="0"/>
+                <w:sz w:val="18"/>
+              </w:rPr>
+              <w:t>1.35 (stealth)</w:t>
+            </w:r>
+          </w:p>
+        </w:tc>
+        <w:tc>
+          <w:tcPr>
+            <w:tcW w:type="dxa" w:w="2351"/>
+          </w:tcPr>
+          <w:p>
+            <w:pPr>
+              <w:spacing w:after="0"/>
+            </w:pPr>
+            <w:r/>
+            <w:r>
+              <w:rPr>
+                <w:b w:val="0"/>
+                <w:sz w:val="18"/>
+              </w:rPr>
+              <w:t>58.4</w:t>
+            </w:r>
+          </w:p>
+        </w:tc>
+        <w:tc>
+          <w:tcPr>
+            <w:tcW w:type="dxa" w:w="2351"/>
+          </w:tcPr>
+          <w:p>
+            <w:pPr>
+              <w:spacing w:after="0"/>
+            </w:pPr>
+            <w:r/>
+            <w:r>
+              <w:rPr>
+                <w:b w:val="0"/>
+                <w:sz w:val="18"/>
+              </w:rPr>
+              <w:t>9.4</w:t>
+            </w:r>
+          </w:p>
+        </w:tc>
+      </w:tr>
+      <w:tr>
+        <w:tc>
+          <w:tcPr>
+            <w:tcW w:type="dxa" w:w="2351"/>
+          </w:tcPr>
+          <w:p>
+            <w:pPr>
+              <w:spacing w:after="0"/>
+            </w:pPr>
+            <w:r/>
+            <w:r>
+              <w:rPr>
+                <w:b w:val="0"/>
+                <w:sz w:val="18"/>
+              </w:rPr>
+              <w:t>6</w:t>
+            </w:r>
+          </w:p>
+        </w:tc>
+        <w:tc>
+          <w:tcPr>
+            <w:tcW w:type="dxa" w:w="2351"/>
+          </w:tcPr>
+          <w:p>
+            <w:pPr>
+              <w:spacing w:after="0"/>
+            </w:pPr>
+            <w:r/>
+            <w:r>
+              <w:rPr>
+                <w:b w:val="0"/>
+                <w:sz w:val="18"/>
+              </w:rPr>
+              <w:t>1.80 (stealth)</w:t>
+            </w:r>
+          </w:p>
+        </w:tc>
+        <w:tc>
+          <w:tcPr>
+            <w:tcW w:type="dxa" w:w="2351"/>
+          </w:tcPr>
+          <w:p>
+            <w:pPr>
+              <w:spacing w:after="0"/>
+            </w:pPr>
+            <w:r/>
+            <w:r>
+              <w:rPr>
+                <w:b w:val="0"/>
+                <w:sz w:val="18"/>
+              </w:rPr>
+              <w:t>82.9</w:t>
+            </w:r>
+          </w:p>
+        </w:tc>
+        <w:tc>
+          <w:tcPr>
+            <w:tcW w:type="dxa" w:w="2351"/>
+          </w:tcPr>
+          <w:p>
+            <w:pPr>
+              <w:spacing w:after="0"/>
+            </w:pPr>
+            <w:r/>
+            <w:r>
+              <w:rPr>
+                <w:b w:val="0"/>
+                <w:sz w:val="18"/>
+              </w:rPr>
+              <w:t>10.8</w:t>
+            </w:r>
+          </w:p>
+        </w:tc>
+      </w:tr>
+      <w:tr>
+        <w:tc>
+          <w:tcPr>
+            <w:tcW w:type="dxa" w:w="2351"/>
+          </w:tcPr>
+          <w:p>
+            <w:pPr>
+              <w:spacing w:after="0"/>
+            </w:pPr>
+            <w:r/>
+            <w:r>
+              <w:rPr>
+                <w:b w:val="0"/>
+                <w:sz w:val="18"/>
+              </w:rPr>
+              <w:t>7</w:t>
+            </w:r>
+          </w:p>
+        </w:tc>
+        <w:tc>
+          <w:tcPr>
+            <w:tcW w:type="dxa" w:w="2351"/>
+          </w:tcPr>
+          <w:p>
+            <w:pPr>
+              <w:spacing w:after="0"/>
+            </w:pPr>
+            <w:r/>
+            <w:r>
+              <w:rPr>
+                <w:b w:val="0"/>
+                <w:sz w:val="18"/>
+              </w:rPr>
+              <w:t>2.30 (stealth)</w:t>
+            </w:r>
+          </w:p>
+        </w:tc>
+        <w:tc>
+          <w:tcPr>
+            <w:tcW w:type="dxa" w:w="2351"/>
+          </w:tcPr>
+          <w:p>
+            <w:pPr>
+              <w:spacing w:after="0"/>
+            </w:pPr>
+            <w:r/>
+            <w:r>
+              <w:rPr>
+                <w:b w:val="0"/>
+                <w:sz w:val="18"/>
+              </w:rPr>
+              <w:t>109.6</w:t>
+            </w:r>
+          </w:p>
+        </w:tc>
+        <w:tc>
+          <w:tcPr>
+            <w:tcW w:type="dxa" w:w="2351"/>
+          </w:tcPr>
+          <w:p>
+            <w:pPr>
+              <w:spacing w:after="0"/>
+            </w:pPr>
+            <w:r/>
+            <w:r>
+              <w:rPr>
+                <w:b w:val="0"/>
+                <w:sz w:val="18"/>
+              </w:rPr>
+              <w:t>13.0</w:t>
+            </w:r>
+          </w:p>
+        </w:tc>
+      </w:tr>
+      <w:tr>
+        <w:tc>
+          <w:tcPr>
+            <w:tcW w:type="dxa" w:w="2351"/>
+          </w:tcPr>
+          <w:p>
+            <w:pPr>
+              <w:spacing w:after="0"/>
+            </w:pPr>
+            <w:r/>
+            <w:r>
+              <w:rPr>
+                <w:b w:val="0"/>
+                <w:sz w:val="18"/>
+              </w:rPr>
+              <w:t>8</w:t>
+            </w:r>
+          </w:p>
+        </w:tc>
+        <w:tc>
+          <w:tcPr>
+            <w:tcW w:type="dxa" w:w="2351"/>
+          </w:tcPr>
+          <w:p>
+            <w:pPr>
+              <w:spacing w:after="0"/>
+            </w:pPr>
+            <w:r/>
+            <w:r>
+              <w:rPr>
+                <w:b w:val="0"/>
+                <w:sz w:val="18"/>
+              </w:rPr>
+              <w:t>2.80 (stealth)</w:t>
+            </w:r>
+          </w:p>
+        </w:tc>
+        <w:tc>
+          <w:tcPr>
+            <w:tcW w:type="dxa" w:w="2351"/>
+          </w:tcPr>
+          <w:p>
+            <w:pPr>
+              <w:spacing w:after="0"/>
+            </w:pPr>
+            <w:r/>
+            <w:r>
+              <w:rPr>
+                <w:b w:val="0"/>
+                <w:sz w:val="18"/>
+              </w:rPr>
+              <w:t>137.9</w:t>
+            </w:r>
+          </w:p>
+        </w:tc>
+        <w:tc>
+          <w:tcPr>
+            <w:tcW w:type="dxa" w:w="2351"/>
+          </w:tcPr>
+          <w:p>
+            <w:pPr>
+              <w:spacing w:after="0"/>
+            </w:pPr>
+            <w:r/>
+            <w:r>
+              <w:rPr>
+                <w:b w:val="0"/>
+                <w:sz w:val="18"/>
+              </w:rPr>
+              <w:t>16.8</w:t>
+            </w:r>
+          </w:p>
+        </w:tc>
+      </w:tr>
+    </w:tbl>
+    <w:p/>
+    <w:p>
+      <w:r>
+        <w:rPr>
+          <w:b/>
+          <w:i w:val="0"/>
+          <w:sz w:val="20"/>
+        </w:rPr>
+        <w:t>Table 6. Platform designed against a fixed attack (a = 8) versus the Stackelberg cutoff (W = 1440 windows/day, H = 5, c_f = 5C, one campaign per day).</w:t>
+      </w:r>
+    </w:p>
+    <w:tbl>
+      <w:tblPr>
+        <w:tblStyle w:val="TableGrid"/>
+        <w:tblW w:type="auto" w:w="0"/>
+        <w:tblLook w:firstColumn="1" w:firstRow="1" w:lastColumn="0" w:lastRow="0" w:noHBand="0" w:noVBand="1" w:val="04A0"/>
+      </w:tblPr>
+      <w:tblGrid>
+        <w:gridCol w:w="1344"/>
+        <w:gridCol w:w="1344"/>
+        <w:gridCol w:w="1344"/>
+        <w:gridCol w:w="1344"/>
+        <w:gridCol w:w="1344"/>
+        <w:gridCol w:w="1344"/>
+        <w:gridCol w:w="1344"/>
+      </w:tblGrid>
+      <w:tr>
+        <w:tc>
+          <w:tcPr>
+            <w:tcW w:type="dxa" w:w="1344"/>
+          </w:tcPr>
+          <w:p>
+            <w:pPr>
+              <w:spacing w:after="0"/>
+            </w:pPr>
+            <w:r/>
+            <w:r>
+              <w:rPr>
+                <w:b/>
+                <w:sz w:val="18"/>
+              </w:rPr>
+              <w:t>Damage d per prompt (units of C)</w:t>
+            </w:r>
+          </w:p>
+        </w:tc>
+        <w:tc>
+          <w:tcPr>
+            <w:tcW w:type="dxa" w:w="1344"/>
+          </w:tcPr>
+          <w:p>
+            <w:pPr>
+              <w:spacing w:after="0"/>
+            </w:pPr>
+            <w:r/>
+            <w:r>
+              <w:rPr>
+                <w:b/>
+                <w:sz w:val="18"/>
+              </w:rPr>
+              <w:t>Naive K (assumes a = 8)</w:t>
+            </w:r>
+          </w:p>
+        </w:tc>
+        <w:tc>
+          <w:tcPr>
+            <w:tcW w:type="dxa" w:w="1344"/>
+          </w:tcPr>
+          <w:p>
+            <w:pPr>
+              <w:spacing w:after="0"/>
+            </w:pPr>
+            <w:r/>
+            <w:r>
+              <w:rPr>
+                <w:b/>
+                <w:sz w:val="18"/>
+              </w:rPr>
+              <w:t>Planned cost</w:t>
+            </w:r>
+          </w:p>
+        </w:tc>
+        <w:tc>
+          <w:tcPr>
+            <w:tcW w:type="dxa" w:w="1344"/>
+          </w:tcPr>
+          <w:p>
+            <w:pPr>
+              <w:spacing w:after="0"/>
+            </w:pPr>
+            <w:r/>
+            <w:r>
+              <w:rPr>
+                <w:b/>
+                <w:sz w:val="18"/>
+              </w:rPr>
+              <w:t>Realized cost vs. best-responding attacker</w:t>
+            </w:r>
+          </w:p>
+        </w:tc>
+        <w:tc>
+          <w:tcPr>
+            <w:tcW w:type="dxa" w:w="1344"/>
+          </w:tcPr>
+          <w:p>
+            <w:pPr>
+              <w:spacing w:after="0"/>
+            </w:pPr>
+            <w:r/>
+            <w:r>
+              <w:rPr>
+                <w:b/>
+                <w:sz w:val="18"/>
+              </w:rPr>
+              <w:t>Stackelberg K^S</w:t>
+            </w:r>
+          </w:p>
+        </w:tc>
+        <w:tc>
+          <w:tcPr>
+            <w:tcW w:type="dxa" w:w="1344"/>
+          </w:tcPr>
+          <w:p>
+            <w:pPr>
+              <w:spacing w:after="0"/>
+            </w:pPr>
+            <w:r/>
+            <w:r>
+              <w:rPr>
+                <w:b/>
+                <w:sz w:val="18"/>
+              </w:rPr>
+              <w:t>Cost at K^S</w:t>
+            </w:r>
+          </w:p>
+        </w:tc>
+        <w:tc>
+          <w:tcPr>
+            <w:tcW w:type="dxa" w:w="1344"/>
+          </w:tcPr>
+          <w:p>
+            <w:pPr>
+              <w:spacing w:after="0"/>
+            </w:pPr>
+            <w:r/>
+            <w:r>
+              <w:rPr>
+                <w:b/>
+                <w:sz w:val="18"/>
+              </w:rPr>
+              <w:t>Reduction in realized cost</w:t>
+            </w:r>
+          </w:p>
+        </w:tc>
+      </w:tr>
+      <w:tr>
+        <w:tc>
+          <w:tcPr>
+            <w:tcW w:type="dxa" w:w="1344"/>
+          </w:tcPr>
+          <w:p>
+            <w:pPr>
+              <w:spacing w:after="0"/>
+            </w:pPr>
+            <w:r/>
+            <w:r>
+              <w:rPr>
+                <w:b w:val="0"/>
+                <w:sz w:val="18"/>
+              </w:rPr>
+              <w:t>0.1</w:t>
+            </w:r>
+          </w:p>
+        </w:tc>
+        <w:tc>
+          <w:tcPr>
+            <w:tcW w:type="dxa" w:w="1344"/>
+          </w:tcPr>
+          <w:p>
+            <w:pPr>
+              <w:spacing w:after="0"/>
+            </w:pPr>
+            <w:r/>
+            <w:r>
+              <w:rPr>
+                <w:b w:val="0"/>
+                <w:sz w:val="18"/>
+              </w:rPr>
+              <w:t>5</w:t>
+            </w:r>
+          </w:p>
+        </w:tc>
+        <w:tc>
+          <w:tcPr>
+            <w:tcW w:type="dxa" w:w="1344"/>
+          </w:tcPr>
+          <w:p>
+            <w:pPr>
+              <w:spacing w:after="0"/>
+            </w:pPr>
+            <w:r/>
+            <w:r>
+              <w:rPr>
+                <w:b w:val="0"/>
+                <w:sz w:val="18"/>
+              </w:rPr>
+              <w:t>1.0</w:t>
+            </w:r>
+          </w:p>
+        </w:tc>
+        <w:tc>
+          <w:tcPr>
+            <w:tcW w:type="dxa" w:w="1344"/>
+          </w:tcPr>
+          <w:p>
+            <w:pPr>
+              <w:spacing w:after="0"/>
+            </w:pPr>
+            <w:r/>
+            <w:r>
+              <w:rPr>
+                <w:b w:val="0"/>
+                <w:sz w:val="18"/>
+              </w:rPr>
+              <w:t>5.9</w:t>
+            </w:r>
+          </w:p>
+        </w:tc>
+        <w:tc>
+          <w:tcPr>
+            <w:tcW w:type="dxa" w:w="1344"/>
+          </w:tcPr>
+          <w:p>
+            <w:pPr>
+              <w:spacing w:after="0"/>
+            </w:pPr>
+            <w:r/>
+            <w:r>
+              <w:rPr>
+                <w:b w:val="0"/>
+                <w:sz w:val="18"/>
+              </w:rPr>
+              <w:t>4</w:t>
+            </w:r>
+          </w:p>
+        </w:tc>
+        <w:tc>
+          <w:tcPr>
+            <w:tcW w:type="dxa" w:w="1344"/>
+          </w:tcPr>
+          <w:p>
+            <w:pPr>
+              <w:spacing w:after="0"/>
+            </w:pPr>
+            <w:r/>
+            <w:r>
+              <w:rPr>
+                <w:b w:val="0"/>
+                <w:sz w:val="18"/>
+              </w:rPr>
+              <w:t>4.9</w:t>
+            </w:r>
+          </w:p>
+        </w:tc>
+        <w:tc>
+          <w:tcPr>
+            <w:tcW w:type="dxa" w:w="1344"/>
+          </w:tcPr>
+          <w:p>
+            <w:pPr>
+              <w:spacing w:after="0"/>
+            </w:pPr>
+            <w:r/>
+            <w:r>
+              <w:rPr>
+                <w:b w:val="0"/>
+                <w:sz w:val="18"/>
+              </w:rPr>
+              <w:t>18%</w:t>
+            </w:r>
+          </w:p>
+        </w:tc>
+      </w:tr>
+      <w:tr>
+        <w:tc>
+          <w:tcPr>
+            <w:tcW w:type="dxa" w:w="1344"/>
+          </w:tcPr>
+          <w:p>
+            <w:pPr>
+              <w:spacing w:after="0"/>
+            </w:pPr>
+            <w:r/>
+            <w:r>
+              <w:rPr>
+                <w:b w:val="0"/>
+                <w:sz w:val="18"/>
+              </w:rPr>
+              <w:t>1</w:t>
+            </w:r>
+          </w:p>
+        </w:tc>
+        <w:tc>
+          <w:tcPr>
+            <w:tcW w:type="dxa" w:w="1344"/>
+          </w:tcPr>
+          <w:p>
+            <w:pPr>
+              <w:spacing w:after="0"/>
+            </w:pPr>
+            <w:r/>
+            <w:r>
+              <w:rPr>
+                <w:b w:val="0"/>
+                <w:sz w:val="18"/>
+              </w:rPr>
+              <w:t>5</w:t>
+            </w:r>
+          </w:p>
+        </w:tc>
+        <w:tc>
+          <w:tcPr>
+            <w:tcW w:type="dxa" w:w="1344"/>
+          </w:tcPr>
+          <w:p>
+            <w:pPr>
+              <w:spacing w:after="0"/>
+            </w:pPr>
+            <w:r/>
+            <w:r>
+              <w:rPr>
+                <w:b w:val="0"/>
+                <w:sz w:val="18"/>
+              </w:rPr>
+              <w:t>9.5</w:t>
+            </w:r>
+          </w:p>
+        </w:tc>
+        <w:tc>
+          <w:tcPr>
+            <w:tcW w:type="dxa" w:w="1344"/>
+          </w:tcPr>
+          <w:p>
+            <w:pPr>
+              <w:spacing w:after="0"/>
+            </w:pPr>
+            <w:r/>
+            <w:r>
+              <w:rPr>
+                <w:b w:val="0"/>
+                <w:sz w:val="18"/>
+              </w:rPr>
+              <w:t>58.5</w:t>
+            </w:r>
+          </w:p>
+        </w:tc>
+        <w:tc>
+          <w:tcPr>
+            <w:tcW w:type="dxa" w:w="1344"/>
+          </w:tcPr>
+          <w:p>
+            <w:pPr>
+              <w:spacing w:after="0"/>
+            </w:pPr>
+            <w:r/>
+            <w:r>
+              <w:rPr>
+                <w:b w:val="0"/>
+                <w:sz w:val="18"/>
+              </w:rPr>
+              <w:t>3</w:t>
+            </w:r>
+          </w:p>
+        </w:tc>
+        <w:tc>
+          <w:tcPr>
+            <w:tcW w:type="dxa" w:w="1344"/>
+          </w:tcPr>
+          <w:p>
+            <w:pPr>
+              <w:spacing w:after="0"/>
+            </w:pPr>
+            <w:r/>
+            <w:r>
+              <w:rPr>
+                <w:b w:val="0"/>
+                <w:sz w:val="18"/>
+              </w:rPr>
+              <w:t>32.6</w:t>
+            </w:r>
+          </w:p>
+        </w:tc>
+        <w:tc>
+          <w:tcPr>
+            <w:tcW w:type="dxa" w:w="1344"/>
+          </w:tcPr>
+          <w:p>
+            <w:pPr>
+              <w:spacing w:after="0"/>
+            </w:pPr>
+            <w:r/>
+            <w:r>
+              <w:rPr>
+                <w:b w:val="0"/>
+                <w:sz w:val="18"/>
+              </w:rPr>
+              <w:t>44%</w:t>
+            </w:r>
+          </w:p>
+        </w:tc>
+      </w:tr>
+      <w:tr>
+        <w:tc>
+          <w:tcPr>
+            <w:tcW w:type="dxa" w:w="1344"/>
+          </w:tcPr>
+          <w:p>
+            <w:pPr>
+              <w:spacing w:after="0"/>
+            </w:pPr>
+            <w:r/>
+            <w:r>
+              <w:rPr>
+                <w:b w:val="0"/>
+                <w:sz w:val="18"/>
+              </w:rPr>
+              <w:t>10</w:t>
+            </w:r>
+          </w:p>
+        </w:tc>
+        <w:tc>
+          <w:tcPr>
+            <w:tcW w:type="dxa" w:w="1344"/>
+          </w:tcPr>
+          <w:p>
+            <w:pPr>
+              <w:spacing w:after="0"/>
+            </w:pPr>
+            <w:r/>
+            <w:r>
+              <w:rPr>
+                <w:b w:val="0"/>
+                <w:sz w:val="18"/>
+              </w:rPr>
+              <w:t>4</w:t>
+            </w:r>
+          </w:p>
+        </w:tc>
+        <w:tc>
+          <w:tcPr>
+            <w:tcW w:type="dxa" w:w="1344"/>
+          </w:tcPr>
+          <w:p>
+            <w:pPr>
+              <w:spacing w:after="0"/>
+            </w:pPr>
+            <w:r/>
+            <w:r>
+              <w:rPr>
+                <w:b w:val="0"/>
+                <w:sz w:val="18"/>
+              </w:rPr>
+              <w:t>87.7</w:t>
+            </w:r>
+          </w:p>
+        </w:tc>
+        <w:tc>
+          <w:tcPr>
+            <w:tcW w:type="dxa" w:w="1344"/>
+          </w:tcPr>
+          <w:p>
+            <w:pPr>
+              <w:spacing w:after="0"/>
+            </w:pPr>
+            <w:r/>
+            <w:r>
+              <w:rPr>
+                <w:b w:val="0"/>
+                <w:sz w:val="18"/>
+              </w:rPr>
+              <w:t>366.5</w:t>
+            </w:r>
+          </w:p>
+        </w:tc>
+        <w:tc>
+          <w:tcPr>
+            <w:tcW w:type="dxa" w:w="1344"/>
+          </w:tcPr>
+          <w:p>
+            <w:pPr>
+              <w:spacing w:after="0"/>
+            </w:pPr>
+            <w:r/>
+            <w:r>
+              <w:rPr>
+                <w:b w:val="0"/>
+                <w:sz w:val="18"/>
+              </w:rPr>
+              <w:t>3</w:t>
+            </w:r>
+          </w:p>
+        </w:tc>
+        <w:tc>
+          <w:tcPr>
+            <w:tcW w:type="dxa" w:w="1344"/>
+          </w:tcPr>
+          <w:p>
+            <w:pPr>
+              <w:spacing w:after="0"/>
+            </w:pPr>
+            <w:r/>
+            <w:r>
+              <w:rPr>
+                <w:b w:val="0"/>
+                <w:sz w:val="18"/>
+              </w:rPr>
+              <w:t>212.6</w:t>
+            </w:r>
+          </w:p>
+        </w:tc>
+        <w:tc>
+          <w:tcPr>
+            <w:tcW w:type="dxa" w:w="1344"/>
+          </w:tcPr>
+          <w:p>
+            <w:pPr>
+              <w:spacing w:after="0"/>
+            </w:pPr>
+            <w:r/>
+            <w:r>
+              <w:rPr>
+                <w:b w:val="0"/>
+                <w:sz w:val="18"/>
+              </w:rPr>
+              <w:t>42%</w:t>
+            </w:r>
+          </w:p>
+        </w:tc>
+      </w:tr>
+    </w:tbl>
+    <w:p/>
+    <w:p>
+      <w:pPr>
+        <w:jc w:val="both"/>
+      </w:pPr>
+      <w:r>
+        <w:rPr>
+          <w:b w:val="0"/>
+          <w:i w:val="0"/>
+        </w:rPr>
+        <w:t>A platform that picks its cutoff assuming a fixed high-intensity attack believes its daily cost is 1.0–87.7 units but incurs 5.9–366.5 against an attacker who best-responds, an understatement of 4.2–6.2 times in the three cases. Choosing the Stackelberg cutoff K^S cuts the realized cost by 18–44%, and lowers the cutoff by one or two steps, i.e., accepts more false triggers in exchange for a smaller stealth region. The gap measures what a non-strategic design loses to an adaptive adversary. These results use the Poisson, time-invariant baseline for tractability and a single campaign per day.</w:t>
       </w:r>
     </w:p>
     <w:p>
@@ -5128,7 +6304,7 @@
           <w:b w:val="0"/>
           <w:i w:val="0"/>
         </w:rPr>
-        <w:t>For platform operators. (1) Gate the guardrail only if screening is costly relative to expected breach loss; otherwise Proposition 1 recommends always-on screening, and the savings reported here are the savings from avoiding it. (2) Calibrate the baseline by time of day: this alone removes a large share of false triggers. (3) Prefer CUSUM-type statistics when moderate-intensity or partly evasive campaigns are the concern, at the price of more screening. (4) Do not use the lexical tier as the sole defense against adaptive adversaries: it is a throughput governor, and Proposition 2 shows how much it concedes. Pair it with rate limiting, per-source tracking, and output-side checks.</w:t>
+        <w:t>For platform operators. (1) Gate the guardrail only if screening is costly relative to expected breach loss; otherwise Proposition 1 recommends always-on screening, and the savings reported here are the savings from avoiding it. (2) Calibrate the baseline by time of day: this alone removes a large share of false triggers. (3) Prefer CUSUM-type statistics when moderate-intensity or partly evasive campaigns are the concern, at the price of more screening. (4) Do not use the lexical tier as the sole defense against adaptive adversaries: it is a throughput governor, and Proposition 2 shows how much it concedes. Pair it with rate limiting, per-source tracking, and output-side checks. (5) Set the threshold against a best-responding attacker (Section 3.7) and cap the per-window admitted rate: the first-window leak sets a floor on unscreened prompts equal to that cap.</w:t>
       </w:r>
     </w:p>
     <w:p>
@@ -5160,7 +6336,7 @@
           <w:b w:val="0"/>
           <w:i w:val="0"/>
         </w:rPr>
-        <w:t>The results come from a synthetic simulation; no production traces were used and the parameters (λ̄₀, diurnal amplitude, κ, campaign length and frequency, ΔL = 240 ms) are illustrative assumptions. We treat Tier 2 as perfect on the traffic it screens, and we do not model its recall, which for real guardrails varies by attack type (it can be estimated with benchmarks such as JailbreakBench or HarmBench). The attacker is non-strategic in the simulation: it does not observe or learn the threshold, whereas Proposition 2 only bounds, rather than solves, the attacker's optimization; a full Stackelberg game between platform and attacker is a natural extension. Costs are per window and ignore the multi-window dynamics created by the cool-down. Capacity is proxied by traffic share rather than measured GPU time, and attack traffic is not added to the load. Proposition 1 is stated for a Poisson baseline; the negative-binomial case has the same structure when the likelihood ratio is monotone but we have not proved it in general. Finally, the lexical tier is assumed to produce a count that is informative about attacks; for domains in which attacks are not lexically distinctive, other Tier 1 features (rates of rejected requests, per-source request entropy, embedding-based distances) would be needed. We regard validation on real platform logs as the most important next step.</w:t>
+        <w:t>The results come from a synthetic simulation; no production traces were used and the parameters (λ̄₀, diurnal amplitude, κ, campaign length and frequency, ΔL = 240 ms) are illustrative assumptions. We treat Tier 2 as perfect on the traffic it screens, and we do not model its recall, which for real guardrails varies by attack type (it can be estimated with benchmarks such as JailbreakBench or HarmBench). The simulation of Section 4 uses a non-strategic attacker; the strategic analysis in Section 3.7 is analytical, assumes the attacker knows the threshold, assumes a single campaign intensity that is constant over the campaign, and uses a Poisson, time-invariant baseline. Dynamic attacker strategies that vary the rate within a campaign, and repeated interaction in which the platform changes its threshold, are not modeled. Costs are per window and ignore the multi-window dynamics created by the cool-down. Capacity is proxied by traffic share rather than measured GPU time, and attack traffic is not added to the load. Proposition 1 requires a log-concave benign distribution (satisfied by the Poisson and by the negative binomial with κ ≥ 1); for κ &lt; 1 the monotonicity is not guaranteed. Finally, the lexical tier is assumed to produce a count that is informative about attacks; for domains in which attacks are not lexically distinctive, other Tier 1 features (rates of rejected requests, per-source request entropy, embedding-based distances) would be needed. We regard validation on real platform logs as the most important next step.</w:t>
       </w:r>
     </w:p>
     <w:p>
@@ -5180,7 +6356,7 @@
           <w:b w:val="0"/>
           <w:i w:val="0"/>
         </w:rPr>
-        <w:t>We framed guardrail activation on LLM platforms as a sequential detection problem with a Cox-process baseline, characterized the cost-minimizing threshold, bounded the throughput an adaptive attacker can sustain undetected, and evaluated the design against four benchmarks. In simulation the design cuts guardrail capacity by about 95% against intense, lexically visible campaigns while covering 98% of malicious prompts, but it concedes low-rate and heavily paraphrased campaigns. The contribution is therefore a quantified design rule and a clear boundary on where the approach works.</w:t>
+        <w:t>We framed guardrail activation on LLM platforms as a sequential detection problem with a Cox-process baseline, characterized the cost-minimizing threshold, bounded the throughput an adaptive attacker can sustain undetected, solved the platform's problem against a best-responding attacker, and evaluated the design against four benchmarks. In simulation the design cuts guardrail capacity by about 95% against intense, lexically visible campaigns while covering 98% of malicious prompts, but it concedes low-rate and heavily paraphrased campaigns. The contribution is therefore a quantified design rule and a clear boundary on where the approach works.</w:t>
       </w:r>
     </w:p>
     <w:p>
@@ -5200,7 +6376,19 @@
           <w:b w:val="0"/>
           <w:i w:val="0"/>
         </w:rPr>
-        <w:t>For integers K ≥ −1 define J(K) = π₀C·P₀(x&gt;K) + π₁ρM·P₁(x≤K) (K = −1 means that Tier 2 is always on). Then J(K+1) − J(K) = −π₀C f₀(K+1) + π₁ρM f₁(K+1) = π₁ρM f₀(K+1) [ L(K+1) − c ], where L(k) = f₁(k)/f₀(k) and c = π₀C/(π₁ρM). Since L is strictly increasing, L(K+1) − c changes sign at most once, from negative to non-negative; so the increments of J are negative and then non-negative, and J is quasi-convex (decreasing, then non-decreasing). The minimizer is the smallest K such that L(K+1) ≥ c, which is the stated K*. Under the Poisson baseline with an independent Poisson(b) increment, L(k) = ((μ₀+b)/μ₀)^k e^{−b}, which is strictly increasing in k for b &gt; 0. K* is non-decreasing in c (hence in C/(ρM)) because the set {K: L(K+1) ≥ c} shrinks as c grows. (The dependence on b is not monotone in general, because ∂ ln L/∂b = k/(μ₀+b) − 1 changes sign at k = μ₀+b; in Table 1 K* rises with b because stronger attacks remain detectable at a higher cutoff, which lowers false triggers.) □</w:t>
+        <w:t>Step 1 (monotone likelihood ratio). Write r(i) = f₀(i−1)/f₀(i) for i ≥ 1. Log-concavity of f₀ means r is non-decreasing. For the negative binomial with success-probability parameter q = μ/(κ+μ), f₀(i)/f₀(i−1) = q(κ+i−1)/i, and d/di [(κ+i−1)/i] = (1−κ)/i² ≤ 0 when κ ≥ 1, so f₀ is log-concave; for the Poisson, f₀(i)/f₀(i−1) = μ/i is decreasing. Since f₁(k) = Σ_{j=0}^{k} g(j) f₀(k−j), we have L(k) = Σ_{j=0}^{k} g(j) Π_{i=k−j+1}^{k} r(i), where the empty product (j = 0) equals 1. Moving from k to k+1, each term with j ≤ k has the same number j of positive factors, each replaced by a factor at least as large (r is non-decreasing), and the term for j = k+1 enters with a positive value. Hence L(k+1) ≥ L(k).</w:t>
+      </w:r>
+    </w:p>
+    <w:p>
+      <w:pPr>
+        <w:jc w:val="both"/>
+      </w:pPr>
+      <w:r>
+        <w:rPr>
+          <w:b w:val="0"/>
+          <w:i w:val="0"/>
+        </w:rPr>
+        <w:t>Step 2 (optimal cutoff). For integers K ≥ −1 define J(K) = π₀C·P₀(x&gt;K) + π₁ρM·P₁(x≤K) (K = −1 means that Tier 2 is always on). Then J(K+1) − J(K) = −π₀C f₀(K+1) + π₁ρM f₁(K+1) = π₁ρM f₀(K+1) [ L(K+1) − c ], with c = π₀C/(π₁ρM). Because L is non-decreasing, L(K+1) − c is negative up to some K and non-negative afterwards, so J decreases and then does not decrease: J is quasi-convex and its minimizer is the smallest K with L(K+1) ≥ c. This set shrinks as c grows, so K* is non-decreasing in c, hence in C/(ρM). For the Poisson case L(k) = ((μ₀+b)/μ₀)^k e^{−b} follows by direct substitution. (The dependence on b is not monotone in general, because ∂ ln L/∂b = k/(μ₀+b) − 1 changes sign at k = μ₀+b; in Table 1, K* rises with b because stronger attacks remain detectable at a higher cutoff, which lowers false triggers.) □</w:t>
       </w:r>
     </w:p>
     <w:p>
@@ -5213,6 +6401,18 @@
           <w:i w:val="0"/>
         </w:rPr>
         <w:t>Proof of Proposition 2. P(Poisson(λ) &gt; K) is strictly increasing in λ, since Poisson distributions are stochastically ordered in the mean; the trigger probability p(b) is a continuous, strictly increasing function of b with p(0) &lt; δ for the false-alarm budget, so p(b) = δ has a unique solution b̄(δ). Windows are conditionally independent given the intensities, so an n-window campaign goes untriggered with probability (1 − p(b))ⁿ. □</w:t>
+      </w:r>
+    </w:p>
+    <w:p>
+      <w:pPr>
+        <w:jc w:val="both"/>
+      </w:pPr>
+      <w:r>
+        <w:rPr>
+          <w:b w:val="0"/>
+          <w:i w:val="0"/>
+        </w:rPr>
+        <w:t>Proof of Proposition 3. (i) p(K,b) is continuous in b and S(p) = (1−(1−p)ⁿ)/p = Σ_{t=0}^{n−1}(1−p)^t is continuous with S → n as p → 0, so U is continuous on [0,ā] with U(K,0) = 0; the maximum over the compact interval exists. (ii) p(K,b) = P(Poisson(μ₀+b) &gt; K) is strictly decreasing in K, and S is strictly decreasing in p, so S(p(K,b)) and therefore U(K,a) are non-decreasing in K for each a; the maximum of non-decreasing functions is non-decreasing. P₀(x&gt;K) is strictly decreasing in K. (iii) S(p) ≥ 1 for every p ∈ [0,1], so U(K,a) ≥ a, and V(K) ≥ U(K,ā) ≥ ā. (iv) S(p) ≤ n and S(p) ≤ 1/p. □</w:t>
       </w:r>
     </w:p>
     <w:p>
@@ -5232,7 +6432,7 @@
           <w:b w:val="0"/>
           <w:i w:val="0"/>
         </w:rPr>
-        <w:t>Python/NumPy, seed 20261008. Benign counts: Poisson(λ₀(t)Z_t) with Z_t ~ Gamma(25, 1/25). λ₀(t) = 0.5[1 + 0.6 sin(2π(m − 540)/1440)] where m is the minute of day. Rule C limits: negative-binomial quantile with shape 25 and mean λ₀(t) at 1 − α. Rule B limit: Poisson quantile at mean 0.5 (K = 4). CUSUM: z_t = (x_t − λ₀(t))/√(λ₀(t) + λ₀(t)²/25), k = 0.5, h = 8.8 (bisection so that benign false triggers match rule C), reset to zero after a trigger. Cool-down: Tier 2 is active in windows t+1…t+5 after a trigger at t. Tier 2 share: Σ v_t·1(on_t) / Σ v_t. Coverage: Σ attack_t·1(on_t) / Σ attack_t. Random sampling: coverage equals the Tier 2 share of rule C in the same scenario.</w:t>
+        <w:t>Python/NumPy, seed 20261008. Benign counts: Poisson(λ₀(t)Z_t) with Z_t ~ Gamma(25, 1/25). λ₀(t) = 0.5[1 + 0.6 sin(2π(m − 540)/1440)] where m is the minute of day. Rule C limits: negative-binomial quantile with shape 25 and mean λ₀(t) at 1 − α. Rule B limit: Poisson quantile at mean 0.5 (K = 4). CUSUM: z_t = (x_t − λ₀(t))/√(λ₀(t) + λ₀(t)²/25), k = 0.5, h = 8.8 (bisection so that benign false triggers match rule C), reset to zero after a trigger. Cool-down: Tier 2 is active in windows t+1…t+5 after a trigger at t. Tier 2 share: Σ v_t·1(on_t) / Σ v_t. Coverage: Σ attack_t·1(on_t) / Σ attack_t. Random sampling: coverage equals the Tier 2 share of rule C in the same scenario. Stackelberg calculations (Tables 5 and 6): Poisson baseline with mean 0.5, n = 60, ā = 20, attacker grid step 0.05, equations (4) and (5); verified by Monte Carlo (20,000 campaigns).</w:t>
       </w:r>
     </w:p>
     <w:p>

</xml_diff>

<commit_message>
Measure Tier 2 guardrail recall; add Section 4.6 and end-to-end coverage
Co-Authored-By: Claude Sonnet 5.5 <noreply@anthropic.com>
Claude-Session: https://claude.ai/code/session_01GxnhmxUGY8a7A6BSHAY7ah
</commit_message>
<xml_diff>
--- a/LLM_Jailbreak_Screening_ISR_revised.docx
+++ b/LLM_Jailbreak_Screening_ISR_revised.docx
@@ -44,7 +44,7 @@
           <w:b w:val="0"/>
           <w:i w:val="0"/>
         </w:rPr>
-        <w:t>Large language model (LLM) platforms defend against jailbreak and prompt-injection attacks with neural guardrail models (e.g., Llama Guard). Running a guardrail on every prompt consumes scarce GPU capacity and adds latency to every legitimate transaction, yet removing it exposes the platform to breach liability. Automated jailbreak campaigns make the problem sharper: they are bursts of high-volume adversarial traffic that appear as a sudden change in the arrival process of policy-violating prompts. We propose a two-tier architecture in which an inexpensive lexical counter (Tier 1) monitors the arrival process of flagged prompts and activates the semantic guardrail (Tier 2) only when the count is statistically inconsistent with a calibrated benign baseline. The baseline is modeled as a doubly stochastic (Cox) Poisson process with a diurnal intensity, which gives a time-varying negative-binomial control limit. We (i) derive the cost-minimizing activation threshold and show it is characterized by a likelihood-ratio condition, (ii) bound the throughput an adaptive attacker can sustain without being detected and solve a Stackelberg game in which the attacker best-responds to the threshold, and (iii) evaluate the design in a simulation of seven-day traces with 300 replications against always-on, fixed-threshold, CUSUM, and random-sampling benchmarks. For high-intensity campaigns (8 prompts/min against a baseline of 0.5/min) the design screens 98% of malicious prompts while using about 5% of the always-on guardrail capacity; a CUSUM statistic dominates the Shewhart-type rule for moderate campaigns. The design is, however, fragile against campaigns that evade Tier 1 lexically, and a threshold designed against a fixed attack understates the cost under a best-responding attacker by a factor of four to six; the Stackelberg threshold reduces that cost by 18–44%. The results yield design rules for cost-effective governance of generative-AI platforms.</w:t>
+        <w:t>Large language model (LLM) platforms defend against jailbreak and prompt-injection attacks with neural guardrail models (e.g., Llama Guard). Running a guardrail on every prompt consumes scarce GPU capacity and adds latency to every legitimate transaction, yet removing it exposes the platform to breach liability. Automated jailbreak campaigns make the problem sharper: they are bursts of high-volume adversarial traffic that appear as a sudden change in the arrival process of policy-violating prompts. We propose a two-tier architecture in which an inexpensive lexical counter (Tier 1) monitors the arrival process of flagged prompts and activates the semantic guardrail (Tier 2) only when the count is statistically inconsistent with a calibrated benign baseline. The baseline is modeled as a doubly stochastic (Cox) Poisson process with a diurnal intensity, which gives a time-varying negative-binomial control limit. We (i) derive the cost-minimizing activation threshold and show it is characterized by a likelihood-ratio condition, (ii) bound the throughput an adaptive attacker can sustain without being detected and solve a Stackelberg game in which the attacker best-responds to the threshold, and (iii) evaluate the design in a simulation of seven-day traces with 300 replications against always-on, fixed-threshold, CUSUM, and random-sampling benchmarks. For high-intensity campaigns (8 prompts/min against a baseline of 0.5/min) the design routes 98% of malicious prompts to the guardrail while using about 5% of the always-on guardrail capacity, and measuring open guardrails on public jailbreak data gives Tier 2 recall of 71–89%, so end-to-end coverage is about 70–87%; a CUSUM statistic dominates the Shewhart-type rule for moderate campaigns. The design is, however, fragile against campaigns that evade Tier 1 lexically, and a threshold designed against a fixed attack understates the cost under a best-responding attacker by a factor of four to six; the Stackelberg threshold reduces that cost by 18–44%. The results yield design rules for cost-effective governance of generative-AI platforms.</w:t>
       </w:r>
     </w:p>
     <w:p>
@@ -6289,6 +6289,996 @@
     </w:p>
     <w:p>
       <w:pPr>
+        <w:pStyle w:val="Heading2"/>
+      </w:pPr>
+      <w:r>
+        <w:t>4.6 Measured Tier 2 recall</w:t>
+      </w:r>
+    </w:p>
+    <w:p>
+      <w:pPr>
+        <w:jc w:val="both"/>
+      </w:pPr>
+      <w:r>
+        <w:rPr>
+          <w:b w:val="0"/>
+          <w:i w:val="0"/>
+        </w:rPr>
+        <w:t>The simulation so far counts a malicious prompt as covered if it arrives while Tier 2 is active, i.e., it treats Tier 2 as perfect. We measured the recall and false-positive rate of two open guardrail models on public data. Models: Qwen3Guard-Gen-0.6B (a generative safety classifier whose output is Safe, Controversial, or Unsafe; "strict" counts Unsafe as a detection, "lenient" counts Unsafe or Controversial) and the DeBERTa-v3-base prompt-injection classifier of Protect AI (v2). Data: (i) 200 prompts labelled jailbreak and 200 labelled regular, drawn at random (seed 20261008) from the JailbreakHub collection of in-the-wild prompts (Shen et al. 2024), and (ii) the 100 harmful and 100 matched benign behaviors of JailbreakBench (Chao et al. 2024), submitted as direct requests. Prompts were truncated to 768 tokens (Qwen) or 512 tokens (DeBERTa). We report the share flagged with Wilson 95% intervals.</w:t>
+      </w:r>
+    </w:p>
+    <w:p>
+      <w:r>
+        <w:rPr>
+          <w:b/>
+          <w:i w:val="0"/>
+          <w:sz w:val="20"/>
+        </w:rPr>
+        <w:t>Table 7. Measured Tier 2 operating characteristics (n = 200 per JailbreakHub class, n = 100 per JailbreakBench class; 95% Wilson intervals in parentheses; times are on a CPU, not a GPU).</w:t>
+      </w:r>
+    </w:p>
+    <w:tbl>
+      <w:tblPr>
+        <w:tblStyle w:val="TableGrid"/>
+        <w:tblW w:type="auto" w:w="0"/>
+        <w:tblLook w:firstColumn="1" w:firstRow="1" w:lastColumn="0" w:lastRow="0" w:noHBand="0" w:noVBand="1" w:val="04A0"/>
+      </w:tblPr>
+      <w:tblGrid>
+        <w:gridCol w:w="1568"/>
+        <w:gridCol w:w="1568"/>
+        <w:gridCol w:w="1568"/>
+        <w:gridCol w:w="1568"/>
+        <w:gridCol w:w="1568"/>
+        <w:gridCol w:w="1568"/>
+      </w:tblGrid>
+      <w:tr>
+        <w:tc>
+          <w:tcPr>
+            <w:tcW w:type="dxa" w:w="1568"/>
+          </w:tcPr>
+          <w:p>
+            <w:pPr>
+              <w:spacing w:after="0"/>
+            </w:pPr>
+            <w:r/>
+            <w:r>
+              <w:rPr>
+                <w:b/>
+                <w:sz w:val="18"/>
+              </w:rPr>
+              <w:t>Model / rule</w:t>
+            </w:r>
+          </w:p>
+        </w:tc>
+        <w:tc>
+          <w:tcPr>
+            <w:tcW w:type="dxa" w:w="1568"/>
+          </w:tcPr>
+          <w:p>
+            <w:pPr>
+              <w:spacing w:after="0"/>
+            </w:pPr>
+            <w:r/>
+            <w:r>
+              <w:rPr>
+                <w:b/>
+                <w:sz w:val="18"/>
+              </w:rPr>
+              <w:t>Jailbreak prompts flagged (recall s)</w:t>
+            </w:r>
+          </w:p>
+        </w:tc>
+        <w:tc>
+          <w:tcPr>
+            <w:tcW w:type="dxa" w:w="1568"/>
+          </w:tcPr>
+          <w:p>
+            <w:pPr>
+              <w:spacing w:after="0"/>
+            </w:pPr>
+            <w:r/>
+            <w:r>
+              <w:rPr>
+                <w:b/>
+                <w:sz w:val="18"/>
+              </w:rPr>
+              <w:t>Regular prompts flagged (FPR)</w:t>
+            </w:r>
+          </w:p>
+        </w:tc>
+        <w:tc>
+          <w:tcPr>
+            <w:tcW w:type="dxa" w:w="1568"/>
+          </w:tcPr>
+          <w:p>
+            <w:pPr>
+              <w:spacing w:after="0"/>
+            </w:pPr>
+            <w:r/>
+            <w:r>
+              <w:rPr>
+                <w:b/>
+                <w:sz w:val="18"/>
+              </w:rPr>
+              <w:t>Harmful direct requests flagged</w:t>
+            </w:r>
+          </w:p>
+        </w:tc>
+        <w:tc>
+          <w:tcPr>
+            <w:tcW w:type="dxa" w:w="1568"/>
+          </w:tcPr>
+          <w:p>
+            <w:pPr>
+              <w:spacing w:after="0"/>
+            </w:pPr>
+            <w:r/>
+            <w:r>
+              <w:rPr>
+                <w:b/>
+                <w:sz w:val="18"/>
+              </w:rPr>
+              <w:t>Benign direct requests flagged</w:t>
+            </w:r>
+          </w:p>
+        </w:tc>
+        <w:tc>
+          <w:tcPr>
+            <w:tcW w:type="dxa" w:w="1568"/>
+          </w:tcPr>
+          <w:p>
+            <w:pPr>
+              <w:spacing w:after="0"/>
+            </w:pPr>
+            <w:r/>
+            <w:r>
+              <w:rPr>
+                <w:b/>
+                <w:sz w:val="18"/>
+              </w:rPr>
+              <w:t>CPU time per prompt (s)</w:t>
+            </w:r>
+          </w:p>
+        </w:tc>
+      </w:tr>
+      <w:tr>
+        <w:tc>
+          <w:tcPr>
+            <w:tcW w:type="dxa" w:w="1568"/>
+          </w:tcPr>
+          <w:p>
+            <w:pPr>
+              <w:spacing w:after="0"/>
+            </w:pPr>
+            <w:r/>
+            <w:r>
+              <w:rPr>
+                <w:b w:val="0"/>
+                <w:sz w:val="18"/>
+              </w:rPr>
+              <w:t>Qwen3Guard-Gen-0.6B, strict</w:t>
+            </w:r>
+          </w:p>
+        </w:tc>
+        <w:tc>
+          <w:tcPr>
+            <w:tcW w:type="dxa" w:w="1568"/>
+          </w:tcPr>
+          <w:p>
+            <w:pPr>
+              <w:spacing w:after="0"/>
+            </w:pPr>
+            <w:r/>
+            <w:r>
+              <w:rPr>
+                <w:b w:val="0"/>
+                <w:sz w:val="18"/>
+              </w:rPr>
+              <w:t>71.0% (64.4–76.8)</w:t>
+            </w:r>
+          </w:p>
+        </w:tc>
+        <w:tc>
+          <w:tcPr>
+            <w:tcW w:type="dxa" w:w="1568"/>
+          </w:tcPr>
+          <w:p>
+            <w:pPr>
+              <w:spacing w:after="0"/>
+            </w:pPr>
+            <w:r/>
+            <w:r>
+              <w:rPr>
+                <w:b w:val="0"/>
+                <w:sz w:val="18"/>
+              </w:rPr>
+              <w:t>10.0% (6.6–14.9)</w:t>
+            </w:r>
+          </w:p>
+        </w:tc>
+        <w:tc>
+          <w:tcPr>
+            <w:tcW w:type="dxa" w:w="1568"/>
+          </w:tcPr>
+          <w:p>
+            <w:pPr>
+              <w:spacing w:after="0"/>
+            </w:pPr>
+            <w:r/>
+            <w:r>
+              <w:rPr>
+                <w:b w:val="0"/>
+                <w:sz w:val="18"/>
+              </w:rPr>
+              <w:t>96.0% (90.2–98.4)</w:t>
+            </w:r>
+          </w:p>
+        </w:tc>
+        <w:tc>
+          <w:tcPr>
+            <w:tcW w:type="dxa" w:w="1568"/>
+          </w:tcPr>
+          <w:p>
+            <w:pPr>
+              <w:spacing w:after="0"/>
+            </w:pPr>
+            <w:r/>
+            <w:r>
+              <w:rPr>
+                <w:b w:val="0"/>
+                <w:sz w:val="18"/>
+              </w:rPr>
+              <w:t>29.0% (21.0–38.5)</w:t>
+            </w:r>
+          </w:p>
+        </w:tc>
+        <w:tc>
+          <w:tcPr>
+            <w:tcW w:type="dxa" w:w="1568"/>
+          </w:tcPr>
+          <w:p>
+            <w:pPr>
+              <w:spacing w:after="0"/>
+            </w:pPr>
+            <w:r/>
+            <w:r>
+              <w:rPr>
+                <w:b w:val="0"/>
+                <w:sz w:val="18"/>
+              </w:rPr>
+              <w:t>2.0–3.6</w:t>
+            </w:r>
+          </w:p>
+        </w:tc>
+      </w:tr>
+      <w:tr>
+        <w:tc>
+          <w:tcPr>
+            <w:tcW w:type="dxa" w:w="1568"/>
+          </w:tcPr>
+          <w:p>
+            <w:pPr>
+              <w:spacing w:after="0"/>
+            </w:pPr>
+            <w:r/>
+            <w:r>
+              <w:rPr>
+                <w:b w:val="0"/>
+                <w:sz w:val="18"/>
+              </w:rPr>
+              <w:t>Qwen3Guard-Gen-0.6B, lenient</w:t>
+            </w:r>
+          </w:p>
+        </w:tc>
+        <w:tc>
+          <w:tcPr>
+            <w:tcW w:type="dxa" w:w="1568"/>
+          </w:tcPr>
+          <w:p>
+            <w:pPr>
+              <w:spacing w:after="0"/>
+            </w:pPr>
+            <w:r/>
+            <w:r>
+              <w:rPr>
+                <w:b w:val="0"/>
+                <w:sz w:val="18"/>
+              </w:rPr>
+              <w:t>88.5% (83.3–92.2)</w:t>
+            </w:r>
+          </w:p>
+        </w:tc>
+        <w:tc>
+          <w:tcPr>
+            <w:tcW w:type="dxa" w:w="1568"/>
+          </w:tcPr>
+          <w:p>
+            <w:pPr>
+              <w:spacing w:after="0"/>
+            </w:pPr>
+            <w:r/>
+            <w:r>
+              <w:rPr>
+                <w:b w:val="0"/>
+                <w:sz w:val="18"/>
+              </w:rPr>
+              <w:t>35.5% (29.2–42.3)</w:t>
+            </w:r>
+          </w:p>
+        </w:tc>
+        <w:tc>
+          <w:tcPr>
+            <w:tcW w:type="dxa" w:w="1568"/>
+          </w:tcPr>
+          <w:p>
+            <w:pPr>
+              <w:spacing w:after="0"/>
+            </w:pPr>
+            <w:r/>
+            <w:r>
+              <w:rPr>
+                <w:b w:val="0"/>
+                <w:sz w:val="18"/>
+              </w:rPr>
+              <w:t>99.0% (94.6–99.8)</w:t>
+            </w:r>
+          </w:p>
+        </w:tc>
+        <w:tc>
+          <w:tcPr>
+            <w:tcW w:type="dxa" w:w="1568"/>
+          </w:tcPr>
+          <w:p>
+            <w:pPr>
+              <w:spacing w:after="0"/>
+            </w:pPr>
+            <w:r/>
+            <w:r>
+              <w:rPr>
+                <w:b w:val="0"/>
+                <w:sz w:val="18"/>
+              </w:rPr>
+              <w:t>60.0% (50.2–69.1)</w:t>
+            </w:r>
+          </w:p>
+        </w:tc>
+        <w:tc>
+          <w:tcPr>
+            <w:tcW w:type="dxa" w:w="1568"/>
+          </w:tcPr>
+          <w:p>
+            <w:pPr>
+              <w:spacing w:after="0"/>
+            </w:pPr>
+            <w:r/>
+            <w:r>
+              <w:rPr>
+                <w:b w:val="0"/>
+                <w:sz w:val="18"/>
+              </w:rPr>
+              <w:t>2.0–3.6</w:t>
+            </w:r>
+          </w:p>
+        </w:tc>
+      </w:tr>
+      <w:tr>
+        <w:tc>
+          <w:tcPr>
+            <w:tcW w:type="dxa" w:w="1568"/>
+          </w:tcPr>
+          <w:p>
+            <w:pPr>
+              <w:spacing w:after="0"/>
+            </w:pPr>
+            <w:r/>
+            <w:r>
+              <w:rPr>
+                <w:b w:val="0"/>
+                <w:sz w:val="18"/>
+              </w:rPr>
+              <w:t>DeBERTa-v3 prompt-injection (v2)</w:t>
+            </w:r>
+          </w:p>
+        </w:tc>
+        <w:tc>
+          <w:tcPr>
+            <w:tcW w:type="dxa" w:w="1568"/>
+          </w:tcPr>
+          <w:p>
+            <w:pPr>
+              <w:spacing w:after="0"/>
+            </w:pPr>
+            <w:r/>
+            <w:r>
+              <w:rPr>
+                <w:b w:val="0"/>
+                <w:sz w:val="18"/>
+              </w:rPr>
+              <w:t>75.5% (69.1–80.9)</w:t>
+            </w:r>
+          </w:p>
+        </w:tc>
+        <w:tc>
+          <w:tcPr>
+            <w:tcW w:type="dxa" w:w="1568"/>
+          </w:tcPr>
+          <w:p>
+            <w:pPr>
+              <w:spacing w:after="0"/>
+            </w:pPr>
+            <w:r/>
+            <w:r>
+              <w:rPr>
+                <w:b w:val="0"/>
+                <w:sz w:val="18"/>
+              </w:rPr>
+              <w:t>13.0% (9.0–18.4)</w:t>
+            </w:r>
+          </w:p>
+        </w:tc>
+        <w:tc>
+          <w:tcPr>
+            <w:tcW w:type="dxa" w:w="1568"/>
+          </w:tcPr>
+          <w:p>
+            <w:pPr>
+              <w:spacing w:after="0"/>
+            </w:pPr>
+            <w:r/>
+            <w:r>
+              <w:rPr>
+                <w:b w:val="0"/>
+                <w:sz w:val="18"/>
+              </w:rPr>
+              <w:t>0.0% (0.0–3.7)</w:t>
+            </w:r>
+          </w:p>
+        </w:tc>
+        <w:tc>
+          <w:tcPr>
+            <w:tcW w:type="dxa" w:w="1568"/>
+          </w:tcPr>
+          <w:p>
+            <w:pPr>
+              <w:spacing w:after="0"/>
+            </w:pPr>
+            <w:r/>
+            <w:r>
+              <w:rPr>
+                <w:b w:val="0"/>
+                <w:sz w:val="18"/>
+              </w:rPr>
+              <w:t>1.0% (0.2–5.4)</w:t>
+            </w:r>
+          </w:p>
+        </w:tc>
+        <w:tc>
+          <w:tcPr>
+            <w:tcW w:type="dxa" w:w="1568"/>
+          </w:tcPr>
+          <w:p>
+            <w:pPr>
+              <w:spacing w:after="0"/>
+            </w:pPr>
+            <w:r/>
+            <w:r>
+              <w:rPr>
+                <w:b w:val="0"/>
+                <w:sz w:val="18"/>
+              </w:rPr>
+              <w:t>0.1–0.6</w:t>
+            </w:r>
+          </w:p>
+        </w:tc>
+      </w:tr>
+    </w:tbl>
+    <w:p/>
+    <w:p>
+      <w:pPr>
+        <w:jc w:val="both"/>
+      </w:pPr>
+      <w:r>
+        <w:rPr>
+          <w:b w:val="0"/>
+          <w:i w:val="0"/>
+        </w:rPr>
+        <w:t>Three findings follow. First, recall against in-the-wild jailbreak prompts is far from perfect: 71% (strict) to 88.5% (lenient) for the generative guardrail and 75.5% for the injection classifier. Second, the operating point matters: the lenient setting gains 17.5 points of recall but flags 36% of regular and 60% of benign direct prompts. Third, the choice of Tier 2 model should depend on the threat. The injection classifier flagged none of the 100 harmful direct requests, because it targets instruction hijacking rather than harmful content, while the generative guardrail flagged 96–99% of them. A platform whose campaigns are jailbreak templates and one whose campaigns are direct harmful requests need different guardrails, and Tier 1 gating applies to either.</w:t>
+      </w:r>
+    </w:p>
+    <w:p>
+      <w:r>
+        <w:rPr>
+          <w:b/>
+          <w:i w:val="0"/>
+          <w:sz w:val="20"/>
+        </w:rPr>
+        <w:t>Table 8. End-to-end coverage of malicious prompts = Tier 1 gating coverage (Table 2, e = 0) × measured Tier 2 recall.</w:t>
+      </w:r>
+    </w:p>
+    <w:tbl>
+      <w:tblPr>
+        <w:tblStyle w:val="TableGrid"/>
+        <w:tblW w:type="auto" w:w="0"/>
+        <w:tblLook w:firstColumn="1" w:firstRow="1" w:lastColumn="0" w:lastRow="0" w:noHBand="0" w:noVBand="1" w:val="04A0"/>
+      </w:tblPr>
+      <w:tblGrid>
+        <w:gridCol w:w="2351"/>
+        <w:gridCol w:w="2351"/>
+        <w:gridCol w:w="2351"/>
+        <w:gridCol w:w="2351"/>
+      </w:tblGrid>
+      <w:tr>
+        <w:tc>
+          <w:tcPr>
+            <w:tcW w:type="dxa" w:w="2351"/>
+          </w:tcPr>
+          <w:p>
+            <w:pPr>
+              <w:spacing w:after="0"/>
+            </w:pPr>
+            <w:r/>
+            <w:r>
+              <w:rPr>
+                <w:b/>
+                <w:sz w:val="18"/>
+              </w:rPr>
+              <w:t>Campaign (Tier 2 setting)</w:t>
+            </w:r>
+          </w:p>
+        </w:tc>
+        <w:tc>
+          <w:tcPr>
+            <w:tcW w:type="dxa" w:w="2351"/>
+          </w:tcPr>
+          <w:p>
+            <w:pPr>
+              <w:spacing w:after="0"/>
+            </w:pPr>
+            <w:r/>
+            <w:r>
+              <w:rPr>
+                <w:b/>
+                <w:sz w:val="18"/>
+              </w:rPr>
+              <w:t>Always-on Tier 2</w:t>
+            </w:r>
+          </w:p>
+        </w:tc>
+        <w:tc>
+          <w:tcPr>
+            <w:tcW w:type="dxa" w:w="2351"/>
+          </w:tcPr>
+          <w:p>
+            <w:pPr>
+              <w:spacing w:after="0"/>
+            </w:pPr>
+            <w:r/>
+            <w:r>
+              <w:rPr>
+                <w:b/>
+                <w:sz w:val="18"/>
+              </w:rPr>
+              <w:t>Gated, rule C</w:t>
+            </w:r>
+          </w:p>
+        </w:tc>
+        <w:tc>
+          <w:tcPr>
+            <w:tcW w:type="dxa" w:w="2351"/>
+          </w:tcPr>
+          <w:p>
+            <w:pPr>
+              <w:spacing w:after="0"/>
+            </w:pPr>
+            <w:r/>
+            <w:r>
+              <w:rPr>
+                <w:b/>
+                <w:sz w:val="18"/>
+              </w:rPr>
+              <w:t>Gated, rule D (CUSUM)</w:t>
+            </w:r>
+          </w:p>
+        </w:tc>
+      </w:tr>
+      <w:tr>
+        <w:tc>
+          <w:tcPr>
+            <w:tcW w:type="dxa" w:w="2351"/>
+          </w:tcPr>
+          <w:p>
+            <w:pPr>
+              <w:spacing w:after="0"/>
+            </w:pPr>
+            <w:r/>
+            <w:r>
+              <w:rPr>
+                <w:b w:val="0"/>
+                <w:sz w:val="18"/>
+              </w:rPr>
+              <w:t>a = 8, Qwen3Guard strict (s = 0.71)</w:t>
+            </w:r>
+          </w:p>
+        </w:tc>
+        <w:tc>
+          <w:tcPr>
+            <w:tcW w:type="dxa" w:w="2351"/>
+          </w:tcPr>
+          <w:p>
+            <w:pPr>
+              <w:spacing w:after="0"/>
+            </w:pPr>
+            <w:r/>
+            <w:r>
+              <w:rPr>
+                <w:b w:val="0"/>
+                <w:sz w:val="18"/>
+              </w:rPr>
+              <w:t>71.0%</w:t>
+            </w:r>
+          </w:p>
+        </w:tc>
+        <w:tc>
+          <w:tcPr>
+            <w:tcW w:type="dxa" w:w="2351"/>
+          </w:tcPr>
+          <w:p>
+            <w:pPr>
+              <w:spacing w:after="0"/>
+            </w:pPr>
+            <w:r/>
+            <w:r>
+              <w:rPr>
+                <w:b w:val="0"/>
+                <w:sz w:val="18"/>
+              </w:rPr>
+              <w:t>69.7%</w:t>
+            </w:r>
+          </w:p>
+        </w:tc>
+        <w:tc>
+          <w:tcPr>
+            <w:tcW w:type="dxa" w:w="2351"/>
+          </w:tcPr>
+          <w:p>
+            <w:pPr>
+              <w:spacing w:after="0"/>
+            </w:pPr>
+            <w:r/>
+            <w:r>
+              <w:rPr>
+                <w:b w:val="0"/>
+                <w:sz w:val="18"/>
+              </w:rPr>
+              <w:t>69.4%</w:t>
+            </w:r>
+          </w:p>
+        </w:tc>
+      </w:tr>
+      <w:tr>
+        <w:tc>
+          <w:tcPr>
+            <w:tcW w:type="dxa" w:w="2351"/>
+          </w:tcPr>
+          <w:p>
+            <w:pPr>
+              <w:spacing w:after="0"/>
+            </w:pPr>
+            <w:r/>
+            <w:r>
+              <w:rPr>
+                <w:b w:val="0"/>
+                <w:sz w:val="18"/>
+              </w:rPr>
+              <w:t>a = 8, Qwen3Guard lenient (s = 0.885)</w:t>
+            </w:r>
+          </w:p>
+        </w:tc>
+        <w:tc>
+          <w:tcPr>
+            <w:tcW w:type="dxa" w:w="2351"/>
+          </w:tcPr>
+          <w:p>
+            <w:pPr>
+              <w:spacing w:after="0"/>
+            </w:pPr>
+            <w:r/>
+            <w:r>
+              <w:rPr>
+                <w:b w:val="0"/>
+                <w:sz w:val="18"/>
+              </w:rPr>
+              <w:t>88.5%</w:t>
+            </w:r>
+          </w:p>
+        </w:tc>
+        <w:tc>
+          <w:tcPr>
+            <w:tcW w:type="dxa" w:w="2351"/>
+          </w:tcPr>
+          <w:p>
+            <w:pPr>
+              <w:spacing w:after="0"/>
+            </w:pPr>
+            <w:r/>
+            <w:r>
+              <w:rPr>
+                <w:b w:val="0"/>
+                <w:sz w:val="18"/>
+              </w:rPr>
+              <w:t>86.9%</w:t>
+            </w:r>
+          </w:p>
+        </w:tc>
+        <w:tc>
+          <w:tcPr>
+            <w:tcW w:type="dxa" w:w="2351"/>
+          </w:tcPr>
+          <w:p>
+            <w:pPr>
+              <w:spacing w:after="0"/>
+            </w:pPr>
+            <w:r/>
+            <w:r>
+              <w:rPr>
+                <w:b w:val="0"/>
+                <w:sz w:val="18"/>
+              </w:rPr>
+              <w:t>86.6%</w:t>
+            </w:r>
+          </w:p>
+        </w:tc>
+      </w:tr>
+      <w:tr>
+        <w:tc>
+          <w:tcPr>
+            <w:tcW w:type="dxa" w:w="2351"/>
+          </w:tcPr>
+          <w:p>
+            <w:pPr>
+              <w:spacing w:after="0"/>
+            </w:pPr>
+            <w:r/>
+            <w:r>
+              <w:rPr>
+                <w:b w:val="0"/>
+                <w:sz w:val="18"/>
+              </w:rPr>
+              <w:t>a = 8, DeBERTa (s = 0.755)</w:t>
+            </w:r>
+          </w:p>
+        </w:tc>
+        <w:tc>
+          <w:tcPr>
+            <w:tcW w:type="dxa" w:w="2351"/>
+          </w:tcPr>
+          <w:p>
+            <w:pPr>
+              <w:spacing w:after="0"/>
+            </w:pPr>
+            <w:r/>
+            <w:r>
+              <w:rPr>
+                <w:b w:val="0"/>
+                <w:sz w:val="18"/>
+              </w:rPr>
+              <w:t>75.5%</w:t>
+            </w:r>
+          </w:p>
+        </w:tc>
+        <w:tc>
+          <w:tcPr>
+            <w:tcW w:type="dxa" w:w="2351"/>
+          </w:tcPr>
+          <w:p>
+            <w:pPr>
+              <w:spacing w:after="0"/>
+            </w:pPr>
+            <w:r/>
+            <w:r>
+              <w:rPr>
+                <w:b w:val="0"/>
+                <w:sz w:val="18"/>
+              </w:rPr>
+              <w:t>74.1%</w:t>
+            </w:r>
+          </w:p>
+        </w:tc>
+        <w:tc>
+          <w:tcPr>
+            <w:tcW w:type="dxa" w:w="2351"/>
+          </w:tcPr>
+          <w:p>
+            <w:pPr>
+              <w:spacing w:after="0"/>
+            </w:pPr>
+            <w:r/>
+            <w:r>
+              <w:rPr>
+                <w:b w:val="0"/>
+                <w:sz w:val="18"/>
+              </w:rPr>
+              <w:t>73.8%</w:t>
+            </w:r>
+          </w:p>
+        </w:tc>
+      </w:tr>
+      <w:tr>
+        <w:tc>
+          <w:tcPr>
+            <w:tcW w:type="dxa" w:w="2351"/>
+          </w:tcPr>
+          <w:p>
+            <w:pPr>
+              <w:spacing w:after="0"/>
+            </w:pPr>
+            <w:r/>
+            <w:r>
+              <w:rPr>
+                <w:b w:val="0"/>
+                <w:sz w:val="18"/>
+              </w:rPr>
+              <w:t>a = 2, Qwen3Guard strict</w:t>
+            </w:r>
+          </w:p>
+        </w:tc>
+        <w:tc>
+          <w:tcPr>
+            <w:tcW w:type="dxa" w:w="2351"/>
+          </w:tcPr>
+          <w:p>
+            <w:pPr>
+              <w:spacing w:after="0"/>
+            </w:pPr>
+            <w:r/>
+            <w:r>
+              <w:rPr>
+                <w:b w:val="0"/>
+                <w:sz w:val="18"/>
+              </w:rPr>
+              <w:t>71.0%</w:t>
+            </w:r>
+          </w:p>
+        </w:tc>
+        <w:tc>
+          <w:tcPr>
+            <w:tcW w:type="dxa" w:w="2351"/>
+          </w:tcPr>
+          <w:p>
+            <w:pPr>
+              <w:spacing w:after="0"/>
+            </w:pPr>
+            <w:r/>
+            <w:r>
+              <w:rPr>
+                <w:b w:val="0"/>
+                <w:sz w:val="18"/>
+              </w:rPr>
+              <w:t>32.6%</w:t>
+            </w:r>
+          </w:p>
+        </w:tc>
+        <w:tc>
+          <w:tcPr>
+            <w:tcW w:type="dxa" w:w="2351"/>
+          </w:tcPr>
+          <w:p>
+            <w:pPr>
+              <w:spacing w:after="0"/>
+            </w:pPr>
+            <w:r/>
+            <w:r>
+              <w:rPr>
+                <w:b w:val="0"/>
+                <w:sz w:val="18"/>
+              </w:rPr>
+              <w:t>57.4%</w:t>
+            </w:r>
+          </w:p>
+        </w:tc>
+      </w:tr>
+      <w:tr>
+        <w:tc>
+          <w:tcPr>
+            <w:tcW w:type="dxa" w:w="2351"/>
+          </w:tcPr>
+          <w:p>
+            <w:pPr>
+              <w:spacing w:after="0"/>
+            </w:pPr>
+            <w:r/>
+            <w:r>
+              <w:rPr>
+                <w:b w:val="0"/>
+                <w:sz w:val="18"/>
+              </w:rPr>
+              <w:t>a = 2, Qwen3Guard lenient</w:t>
+            </w:r>
+          </w:p>
+        </w:tc>
+        <w:tc>
+          <w:tcPr>
+            <w:tcW w:type="dxa" w:w="2351"/>
+          </w:tcPr>
+          <w:p>
+            <w:pPr>
+              <w:spacing w:after="0"/>
+            </w:pPr>
+            <w:r/>
+            <w:r>
+              <w:rPr>
+                <w:b w:val="0"/>
+                <w:sz w:val="18"/>
+              </w:rPr>
+              <w:t>88.5%</w:t>
+            </w:r>
+          </w:p>
+        </w:tc>
+        <w:tc>
+          <w:tcPr>
+            <w:tcW w:type="dxa" w:w="2351"/>
+          </w:tcPr>
+          <w:p>
+            <w:pPr>
+              <w:spacing w:after="0"/>
+            </w:pPr>
+            <w:r/>
+            <w:r>
+              <w:rPr>
+                <w:b w:val="0"/>
+                <w:sz w:val="18"/>
+              </w:rPr>
+              <w:t>40.6%</w:t>
+            </w:r>
+          </w:p>
+        </w:tc>
+        <w:tc>
+          <w:tcPr>
+            <w:tcW w:type="dxa" w:w="2351"/>
+          </w:tcPr>
+          <w:p>
+            <w:pPr>
+              <w:spacing w:after="0"/>
+            </w:pPr>
+            <w:r/>
+            <w:r>
+              <w:rPr>
+                <w:b w:val="0"/>
+                <w:sz w:val="18"/>
+              </w:rPr>
+              <w:t>71.6%</w:t>
+            </w:r>
+          </w:p>
+        </w:tc>
+      </w:tr>
+    </w:tbl>
+    <w:p/>
+    <w:p>
+      <w:pPr>
+        <w:jc w:val="both"/>
+      </w:pPr>
+      <w:r>
+        <w:rPr>
+          <w:b w:val="0"/>
+          <w:i w:val="0"/>
+        </w:rPr>
+        <w:t>Multiplying the coverage of Table 2 by the measured recall gives end-to-end coverage (Table 8). For an intense campaign (a = 8), gating retains 98% of what always-on screening would catch (69.7% versus 71.0% for the strict Qwen3Guard setting), while using 4.7% of the capacity. The gating cost is therefore small for intense campaigns and large for moderate ones: at a = 2 rule C reaches 32.6% end-to-end versus 71.0% always-on, and CUSUM 57.4%. A second effect favors gating. Because the guardrail has a non-trivial false-positive rate on legitimate traffic, always-on screening flags 10% of regular prompts under the strict Qwen3Guard setting, while gated screening applies the guardrail to 4.7% of traffic during an intense campaign and would flag about 0.47% (0.2–1.7% across the three settings and two campaign intensities, using the measured rates and the Tier 2 shares of Table 2). This user-facing benefit is not captured by the capacity measure. The jailbreak recall and the false-positive rate come from different subsets of one collection, and the "regular" label in JailbreakHub is not verified as benign, so the false-positive rates are rough estimates.</w:t>
+      </w:r>
+    </w:p>
+    <w:p>
+      <w:pPr>
+        <w:jc w:val="both"/>
+      </w:pPr>
+      <w:r>
+        <w:rPr>
+          <w:b w:val="0"/>
+          <w:i w:val="0"/>
+        </w:rPr>
+        <w:t>Latency. Measured on a CPU, the 0.6B generative guardrail needs 2.0–3.6 s per prompt and the DeBERTa classifier 0.1–0.6 s. These are not GPU latencies and do not validate the 240 ms added latency used in Section 4.1; the latter remains an assumption to be replaced by platform measurements.</w:t>
+      </w:r>
+    </w:p>
+    <w:p>
+      <w:pPr>
         <w:pStyle w:val="Heading1"/>
       </w:pPr>
       <w:r>
@@ -6336,7 +7326,7 @@
           <w:b w:val="0"/>
           <w:i w:val="0"/>
         </w:rPr>
-        <w:t>The results come from a synthetic simulation; no production traces were used and the parameters (λ̄₀, diurnal amplitude, κ, campaign length and frequency, ΔL = 240 ms) are illustrative assumptions. We treat Tier 2 as perfect on the traffic it screens, and we do not model its recall, which for real guardrails varies by attack type (it can be estimated with benchmarks such as JailbreakBench or HarmBench). The simulation of Section 4 uses a non-strategic attacker; the strategic analysis in Section 3.7 is analytical, assumes the attacker knows the threshold, assumes a single campaign intensity that is constant over the campaign, and uses a Poisson, time-invariant baseline. Dynamic attacker strategies that vary the rate within a campaign, and repeated interaction in which the platform changes its threshold, are not modeled. Costs are per window and ignore the multi-window dynamics created by the cool-down. Capacity is proxied by traffic share rather than measured GPU time, and attack traffic is not added to the load. Proposition 1 requires a log-concave benign distribution (satisfied by the Poisson and by the negative binomial with κ ≥ 1); for κ &lt; 1 the monotonicity is not guaranteed. Finally, the lexical tier is assumed to produce a count that is informative about attacks; for domains in which attacks are not lexically distinctive, other Tier 1 features (rates of rejected requests, per-source request entropy, embedding-based distances) would be needed. We regard validation on real platform logs as the most important next step.</w:t>
+        <w:t>The traffic results come from a synthetic simulation (the guardrail recall in Section 4.6 is measured); no production traces were used and the parameters (λ̄₀, diurnal amplitude, κ, campaign length and frequency, ΔL = 240 ms) are illustrative assumptions. In the simulation of Sections 4.2–4.5 Tier 2 is perfect on the traffic it screens; Section 4.6 corrects for this by multiplying with measured recall, which assumes the recall is the same for all attack prompts in a campaign and independent of the Tier 1 trigger. The measurement covers two open models on two public collections, with 200 or 100 prompts per class, prompts truncated to 512–768 tokens, and community labels (JailbreakHub) that were not manually verified; we did not evaluate Llama Guard (the weights are gated) or HarmBench, and the jailbreak prompts are older in-the-wild templates rather than the output of current optimization-based attacks. The simulation of Section 4 uses a non-strategic attacker; the strategic analysis in Section 3.7 is analytical, assumes the attacker knows the threshold, assumes a single campaign intensity that is constant over the campaign, and uses a Poisson, time-invariant baseline. Dynamic attacker strategies that vary the rate within a campaign, and repeated interaction in which the platform changes its threshold, are not modeled. Costs are per window and ignore the multi-window dynamics created by the cool-down. Capacity is proxied by traffic share rather than measured GPU time, and attack traffic is not added to the load. Proposition 1 requires a log-concave benign distribution (satisfied by the Poisson and by the negative binomial with κ ≥ 1); for κ &lt; 1 the monotonicity is not guaranteed. Finally, the lexical tier is assumed to produce a count that is informative about attacks; for domains in which attacks are not lexically distinctive, other Tier 1 features (rates of rejected requests, per-source request entropy, embedding-based distances) would be needed. We regard validation on real platform logs as the most important next step.</w:t>
       </w:r>
     </w:p>
     <w:p>
@@ -6432,7 +7422,7 @@
           <w:b w:val="0"/>
           <w:i w:val="0"/>
         </w:rPr>
-        <w:t>Python/NumPy, seed 20261008. Benign counts: Poisson(λ₀(t)Z_t) with Z_t ~ Gamma(25, 1/25). λ₀(t) = 0.5[1 + 0.6 sin(2π(m − 540)/1440)] where m is the minute of day. Rule C limits: negative-binomial quantile with shape 25 and mean λ₀(t) at 1 − α. Rule B limit: Poisson quantile at mean 0.5 (K = 4). CUSUM: z_t = (x_t − λ₀(t))/√(λ₀(t) + λ₀(t)²/25), k = 0.5, h = 8.8 (bisection so that benign false triggers match rule C), reset to zero after a trigger. Cool-down: Tier 2 is active in windows t+1…t+5 after a trigger at t. Tier 2 share: Σ v_t·1(on_t) / Σ v_t. Coverage: Σ attack_t·1(on_t) / Σ attack_t. Random sampling: coverage equals the Tier 2 share of rule C in the same scenario. Stackelberg calculations (Tables 5 and 6): Poisson baseline with mean 0.5, n = 60, ā = 20, attacker grid step 0.05, equations (4) and (5); verified by Monte Carlo (20,000 campaigns).</w:t>
+        <w:t>Python/NumPy, seed 20261008. Benign counts: Poisson(λ₀(t)Z_t) with Z_t ~ Gamma(25, 1/25). λ₀(t) = 0.5[1 + 0.6 sin(2π(m − 540)/1440)] where m is the minute of day. Rule C limits: negative-binomial quantile with shape 25 and mean λ₀(t) at 1 − α. Rule B limit: Poisson quantile at mean 0.5 (K = 4). CUSUM: z_t = (x_t − λ₀(t))/√(λ₀(t) + λ₀(t)²/25), k = 0.5, h = 8.8 (bisection so that benign false triggers match rule C), reset to zero after a trigger. Cool-down: Tier 2 is active in windows t+1…t+5 after a trigger at t. Tier 2 share: Σ v_t·1(on_t) / Σ v_t. Coverage: Σ attack_t·1(on_t) / Σ attack_t. Random sampling: coverage equals the Tier 2 share of rule C in the same scenario. Tier 2 measurement (Section 4.6): Qwen/Qwen3Guard-Gen-0.6B (greedy decoding, 12 new tokens, fp32, CPU) and protectai/deberta-v3-base-prompt-injection-v2; datasets walledai/JailbreakHub (15,140 prompts; 1,405 labelled jailbreak) and JailbreakBench/JBB-Behaviors (Goal field); random subsamples with seed 20261008; Wilson intervals; raw per-prompt predictions are provided with the code. Stackelberg calculations (Tables 5 and 6): Poisson baseline with mean 0.5, n = 60, ā = 20, attacker grid step 0.05, equations (4) and (5); verified by Monte Carlo (20,000 campaigns).</w:t>
       </w:r>
     </w:p>
     <w:p>
@@ -6649,6 +7639,19 @@
           <w:sz w:val="20"/>
         </w:rPr>
         <w:t>Perez, F., and Ribeiro, I. 2022. "Ignore Previous Prompt: Attack Techniques for Language Models," arXiv:2211.09527.</w:t>
+      </w:r>
+    </w:p>
+    <w:p>
+      <w:pPr>
+        <w:ind w:left="454" w:hanging="454"/>
+      </w:pPr>
+      <w:r>
+        <w:rPr>
+          <w:b w:val="0"/>
+          <w:i w:val="0"/>
+          <w:sz w:val="20"/>
+        </w:rPr>
+        <w:t>Shen, X., Chen, Z., Backes, M., Shen, Y., and Zhang, Y. 2024. "Do Anything Now: Characterizing and Evaluating In-The-Wild Jailbreak Prompts on Large Language Models," Proceedings of the ACM SIGSAC Conference on Computer and Communications Security (CCS).</w:t>
       </w:r>
     </w:p>
     <w:p>

</xml_diff>